<commit_message>
created raw data for resume and generated pdf file of resume
</commit_message>
<xml_diff>
--- a/Complete_Resume.docx
+++ b/Complete_Resume.docx
@@ -4,11 +4,13 @@
   <w:body>
     <w:p>
       <w:pPr>
+        <w:spacing w:after="0"/>
         <w:jc w:val="center"/>
         <w:rPr>
           <w:b/>
           <w:sz w:val="36"/>
           <w:szCs w:val="24"/>
+          <w:u w:val="single"/>
         </w:rPr>
       </w:pPr>
       <w:r>
@@ -16,8 +18,9 @@
           <w:b/>
           <w:sz w:val="36"/>
           <w:szCs w:val="24"/>
-        </w:rPr>
-        <w:t>Shubham Kumar</w:t>
+          <w:u w:val="single"/>
+        </w:rPr>
+        <w:t xml:space="preserve">SHUBHAM KUMAR </w:t>
       </w:r>
     </w:p>
     <w:p>
@@ -35,7 +38,7 @@
             <w:sz w:val="24"/>
             <w:szCs w:val="24"/>
           </w:rPr>
-          <w:t>Shubhamkumar200334@gmail.com</w:t>
+          <w:t>shubhamkumar200334@gmail.com</w:t>
         </w:r>
       </w:hyperlink>
       <w:r>
@@ -157,23 +160,94 @@
           <w:sz w:val="24"/>
           <w:szCs w:val="24"/>
         </w:rPr>
-        <w:t xml:space="preserve">Maharaja Agrasen Institute of Technology – BTech in Information Technology (2021 – 2025) </w:t>
-      </w:r>
-    </w:p>
-    <w:p>
-      <w:pPr>
-        <w:spacing w:after="0"/>
-        <w:rPr>
-          <w:sz w:val="24"/>
-          <w:szCs w:val="24"/>
-        </w:rPr>
-      </w:pPr>
-      <w:r>
-        <w:rPr>
-          <w:sz w:val="24"/>
-          <w:szCs w:val="24"/>
-        </w:rPr>
-        <w:t xml:space="preserve">Gandhi Harizan CO-ED Govt SSS – Class 12th (2019 – 2021) </w:t>
+        <w:t xml:space="preserve">Maharaja Agrasen Institute of Technology – BTech in Information Technology </w:t>
+      </w:r>
+      <w:r>
+        <w:rPr>
+          <w:sz w:val="24"/>
+          <w:szCs w:val="24"/>
+        </w:rPr>
+        <w:t xml:space="preserve">                                        </w:t>
+      </w:r>
+      <w:r>
+        <w:rPr>
+          <w:sz w:val="24"/>
+          <w:szCs w:val="24"/>
+        </w:rPr>
+        <w:t xml:space="preserve">(2021 – 2025) </w:t>
+      </w:r>
+    </w:p>
+    <w:p>
+      <w:pPr>
+        <w:spacing w:after="0"/>
+        <w:rPr>
+          <w:sz w:val="24"/>
+          <w:szCs w:val="24"/>
+        </w:rPr>
+      </w:pPr>
+      <w:r>
+        <w:rPr>
+          <w:sz w:val="24"/>
+          <w:szCs w:val="24"/>
+        </w:rPr>
+        <w:t xml:space="preserve">Gandhi Harizan CO-ED Govt SSS – Class 12th </w:t>
+      </w:r>
+      <w:r>
+        <w:rPr>
+          <w:sz w:val="24"/>
+          <w:szCs w:val="24"/>
+        </w:rPr>
+        <w:tab/>
+      </w:r>
+      <w:r>
+        <w:rPr>
+          <w:sz w:val="24"/>
+          <w:szCs w:val="24"/>
+        </w:rPr>
+        <w:tab/>
+      </w:r>
+      <w:r>
+        <w:rPr>
+          <w:sz w:val="24"/>
+          <w:szCs w:val="24"/>
+        </w:rPr>
+        <w:tab/>
+      </w:r>
+      <w:r>
+        <w:rPr>
+          <w:sz w:val="24"/>
+          <w:szCs w:val="24"/>
+        </w:rPr>
+        <w:tab/>
+      </w:r>
+      <w:r>
+        <w:rPr>
+          <w:sz w:val="24"/>
+          <w:szCs w:val="24"/>
+        </w:rPr>
+        <w:tab/>
+      </w:r>
+      <w:r>
+        <w:rPr>
+          <w:sz w:val="24"/>
+          <w:szCs w:val="24"/>
+        </w:rPr>
+        <w:tab/>
+      </w:r>
+      <w:r>
+        <w:rPr>
+          <w:sz w:val="24"/>
+          <w:szCs w:val="24"/>
+        </w:rPr>
+        <w:tab/>
+        <w:t xml:space="preserve">       </w:t>
+      </w:r>
+      <w:r>
+        <w:rPr>
+          <w:sz w:val="24"/>
+          <w:szCs w:val="24"/>
+        </w:rPr>
+        <w:t xml:space="preserve">(2019 – 2021) </w:t>
       </w:r>
     </w:p>
     <w:p>
@@ -189,320 +263,14 @@
           <w:sz w:val="24"/>
           <w:szCs w:val="24"/>
         </w:rPr>
-        <w:t>Canterbury Public School Delhi – Class 10th (2018 – 2019)</w:t>
-      </w:r>
-    </w:p>
-    <w:p>
-      <w:pPr>
-        <w:spacing w:after="0"/>
-        <w:rPr>
-          <w:b/>
-          <w:sz w:val="32"/>
-          <w:szCs w:val="24"/>
-          <w:u w:val="single"/>
-        </w:rPr>
-      </w:pPr>
-      <w:r>
-        <w:rPr>
-          <w:b/>
-          <w:sz w:val="32"/>
-          <w:szCs w:val="24"/>
-          <w:u w:val="single"/>
-        </w:rPr>
-        <w:t>S</w:t>
-      </w:r>
-      <w:r>
-        <w:rPr>
-          <w:b/>
-          <w:sz w:val="32"/>
-          <w:szCs w:val="24"/>
-          <w:u w:val="single"/>
-        </w:rPr>
-        <w:t xml:space="preserve">kills </w:t>
-      </w:r>
-    </w:p>
-    <w:p>
-      <w:pPr>
-        <w:spacing w:after="0"/>
-        <w:rPr>
-          <w:sz w:val="24"/>
-          <w:szCs w:val="24"/>
-        </w:rPr>
-      </w:pPr>
-      <w:r>
-        <w:rPr>
-          <w:sz w:val="24"/>
-          <w:szCs w:val="24"/>
-        </w:rPr>
-        <w:t xml:space="preserve">Programming – </w:t>
-      </w:r>
-      <w:r>
-        <w:rPr>
-          <w:b/>
-          <w:sz w:val="24"/>
-          <w:szCs w:val="24"/>
-        </w:rPr>
-        <w:t>C/C++ (500+ DSA solved)|C# (.NET)|JavaScript|Python|Java</w:t>
-      </w:r>
-      <w:r>
-        <w:rPr>
-          <w:sz w:val="24"/>
-          <w:szCs w:val="24"/>
-        </w:rPr>
-        <w:t xml:space="preserve"> </w:t>
-      </w:r>
-    </w:p>
-    <w:p>
-      <w:pPr>
-        <w:spacing w:after="0"/>
-        <w:rPr>
-          <w:b/>
-          <w:sz w:val="24"/>
-          <w:szCs w:val="24"/>
-        </w:rPr>
-      </w:pPr>
-      <w:r>
-        <w:rPr>
-          <w:sz w:val="24"/>
-          <w:szCs w:val="24"/>
-        </w:rPr>
-        <w:t xml:space="preserve">Database – </w:t>
-      </w:r>
-      <w:r>
-        <w:rPr>
-          <w:b/>
-          <w:sz w:val="24"/>
-          <w:szCs w:val="24"/>
-        </w:rPr>
-        <w:t xml:space="preserve">MySql|SqlServer|MongoDb </w:t>
-      </w:r>
-    </w:p>
-    <w:p>
-      <w:pPr>
-        <w:spacing w:after="0"/>
-        <w:rPr>
-          <w:sz w:val="24"/>
-          <w:szCs w:val="24"/>
-        </w:rPr>
-      </w:pPr>
-      <w:r>
-        <w:rPr>
-          <w:sz w:val="24"/>
-          <w:szCs w:val="24"/>
-        </w:rPr>
-        <w:t xml:space="preserve">Technology/Frameworks </w:t>
-      </w:r>
-      <w:r>
-        <w:rPr>
-          <w:b/>
-          <w:sz w:val="24"/>
-          <w:szCs w:val="24"/>
-        </w:rPr>
-        <w:t>– HTML/CSS/JS|MERN stack|ASP.NET/C#|Django</w:t>
-      </w:r>
-      <w:r>
-        <w:rPr>
-          <w:sz w:val="24"/>
-          <w:szCs w:val="24"/>
-        </w:rPr>
-        <w:t xml:space="preserve"> </w:t>
-      </w:r>
-    </w:p>
-    <w:p>
-      <w:pPr>
-        <w:spacing w:after="0"/>
-        <w:rPr>
-          <w:sz w:val="24"/>
-          <w:szCs w:val="24"/>
-        </w:rPr>
-      </w:pPr>
-      <w:r>
-        <w:rPr>
-          <w:sz w:val="24"/>
-          <w:szCs w:val="24"/>
-        </w:rPr>
-        <w:t xml:space="preserve">Tools </w:t>
-      </w:r>
-      <w:r>
-        <w:rPr>
-          <w:b/>
-          <w:sz w:val="24"/>
-          <w:szCs w:val="24"/>
-        </w:rPr>
-        <w:t>– Postman|Google Cloud|Git|Github|Docker|Firebase|Jupyter Notebook</w:t>
-      </w:r>
-      <w:r>
-        <w:rPr>
-          <w:sz w:val="24"/>
-          <w:szCs w:val="24"/>
-        </w:rPr>
-        <w:t xml:space="preserve"> </w:t>
-      </w:r>
-    </w:p>
-    <w:p>
-      <w:pPr>
-        <w:spacing w:after="240"/>
-        <w:rPr>
-          <w:b/>
-          <w:sz w:val="24"/>
-          <w:szCs w:val="24"/>
-        </w:rPr>
-      </w:pPr>
-      <w:r>
-        <w:rPr>
-          <w:sz w:val="24"/>
-          <w:szCs w:val="24"/>
-        </w:rPr>
-        <w:t xml:space="preserve">Computer Fundamentals – </w:t>
-      </w:r>
-      <w:r>
-        <w:rPr>
-          <w:b/>
-          <w:sz w:val="24"/>
-          <w:szCs w:val="24"/>
-        </w:rPr>
-        <w:t>OOP|DBMS|Computer Networks|Operating System</w:t>
-      </w:r>
-    </w:p>
-    <w:p>
-      <w:pPr>
-        <w:spacing w:after="0"/>
-        <w:rPr>
-          <w:b/>
-          <w:sz w:val="32"/>
-          <w:szCs w:val="24"/>
-          <w:u w:val="single"/>
-        </w:rPr>
-      </w:pPr>
-      <w:r>
-        <w:rPr>
-          <w:b/>
-          <w:sz w:val="32"/>
-          <w:szCs w:val="24"/>
-          <w:u w:val="single"/>
-        </w:rPr>
-        <w:t>Full-Time Experience</w:t>
-      </w:r>
-    </w:p>
-    <w:p>
-      <w:pPr>
-        <w:spacing w:after="0"/>
-        <w:rPr>
-          <w:sz w:val="24"/>
-          <w:szCs w:val="24"/>
-        </w:rPr>
-      </w:pPr>
-      <w:r>
-        <w:rPr>
-          <w:b/>
-          <w:sz w:val="24"/>
-          <w:szCs w:val="24"/>
-        </w:rPr>
-        <w:t xml:space="preserve">-Cognizant Technology Solution </w:t>
-      </w:r>
-      <w:r>
-        <w:rPr>
-          <w:b/>
-          <w:sz w:val="24"/>
-          <w:szCs w:val="24"/>
-        </w:rPr>
-        <w:t xml:space="preserve">                                                                                                           </w:t>
-      </w:r>
-      <w:r>
-        <w:rPr>
-          <w:b/>
-          <w:sz w:val="24"/>
-          <w:szCs w:val="24"/>
-        </w:rPr>
-        <w:t>(Nov 2025 – Present)</w:t>
-      </w:r>
-    </w:p>
-    <w:p>
-      <w:pPr>
-        <w:spacing w:after="0"/>
-        <w:jc w:val="both"/>
-      </w:pPr>
-      <w:r>
-        <w:rPr>
-          <w:sz w:val="24"/>
-          <w:szCs w:val="24"/>
-        </w:rPr>
-        <w:t xml:space="preserve">    1.</w:t>
-      </w:r>
-      <w:r>
-        <w:t xml:space="preserve">  Worked on the CHUBB Insurance domain in a production support role, utilizing C#, SQL Server, ServiceNow, and internal enterprise tools to analyze issues, understand complex codebases, and deliver reliable, production-ready fixes.</w:t>
-      </w:r>
-    </w:p>
-    <w:p>
-      <w:pPr>
-        <w:spacing w:after="0"/>
-        <w:jc w:val="both"/>
-        <w:rPr>
-          <w:sz w:val="24"/>
-          <w:szCs w:val="24"/>
-        </w:rPr>
-      </w:pPr>
-      <w:r>
-        <w:rPr>
-          <w:sz w:val="24"/>
-          <w:szCs w:val="24"/>
-        </w:rPr>
-        <w:t xml:space="preserve">    2. </w:t>
-      </w:r>
-      <w:r>
-        <w:rPr>
-          <w:sz w:val="24"/>
-          <w:szCs w:val="24"/>
-        </w:rPr>
-        <w:t>Successfully resolved 40+ tickets involving bug fixing, data corrections, and logic enhancements, ensuring detailed documentation and validating SQL scripts across multiple environments (Dev, Stage, Production) to maintain consistency and data integrity.</w:t>
-      </w:r>
-    </w:p>
-    <w:p>
-      <w:pPr>
-        <w:spacing w:after="0"/>
-        <w:jc w:val="both"/>
-        <w:rPr>
-          <w:sz w:val="24"/>
-          <w:szCs w:val="24"/>
-        </w:rPr>
-      </w:pPr>
-      <w:r>
-        <w:rPr>
-          <w:sz w:val="24"/>
-          <w:szCs w:val="24"/>
-        </w:rPr>
-        <w:t xml:space="preserve">    3. </w:t>
-      </w:r>
-      <w:r>
-        <w:rPr>
-          <w:sz w:val="24"/>
-          <w:szCs w:val="24"/>
-        </w:rPr>
-        <w:t>Designed and developed multiple C# console-based automation tools to streamline repetitive tasks such as data extraction, transformation, and reporting, significantly reducing manual effort and improving turnaround time by ~15–20 minutes per ticket.</w:t>
-      </w:r>
-    </w:p>
-    <w:p>
-      <w:pPr>
-        <w:spacing w:after="0"/>
-        <w:jc w:val="both"/>
-        <w:rPr>
-          <w:sz w:val="24"/>
-          <w:szCs w:val="24"/>
-        </w:rPr>
-      </w:pPr>
-      <w:r>
-        <w:rPr>
-          <w:sz w:val="24"/>
-          <w:szCs w:val="24"/>
-        </w:rPr>
-        <w:t xml:space="preserve">    4. </w:t>
-      </w:r>
-      <w:r>
-        <w:rPr>
-          <w:sz w:val="24"/>
-          <w:szCs w:val="24"/>
-        </w:rPr>
-        <w:t>Gained hands-on experience w</w:t>
+        <w:t xml:space="preserve">Canterbury Public School Delhi – Class 10th </w:t>
+      </w:r>
+      <w:r>
+        <w:rPr>
+          <w:sz w:val="24"/>
+          <w:szCs w:val="24"/>
+        </w:rPr>
+        <w:tab/>
       </w:r>
       <w:bookmarkStart w:id="0" w:name="_GoBack"/>
       <w:bookmarkEnd w:id="0"/>
@@ -511,42 +279,58 @@
           <w:sz w:val="24"/>
           <w:szCs w:val="24"/>
         </w:rPr>
-        <w:t>ith advanced concepts such as multithreading, file management, and process execution in C#, applying them to build efficient, scalable, and performance-optimized automation solutions.</w:t>
-      </w:r>
-    </w:p>
-    <w:p>
-      <w:pPr>
-        <w:spacing w:after="0"/>
-        <w:jc w:val="both"/>
-        <w:rPr>
-          <w:sz w:val="24"/>
-          <w:szCs w:val="24"/>
-        </w:rPr>
-      </w:pPr>
-      <w:r>
-        <w:rPr>
-          <w:sz w:val="24"/>
-          <w:szCs w:val="24"/>
-        </w:rPr>
-        <w:t xml:space="preserve">    5. </w:t>
-      </w:r>
-      <w:r>
-        <w:rPr>
-          <w:sz w:val="24"/>
-          <w:szCs w:val="24"/>
-        </w:rPr>
-        <w:t>Built modular and reusable utilities with configurable presets (server name, database, tables) and caching mechanisms to handle environment variations efficiently, while continuously improving through DSA practice and learning modern .NET best practices.</w:t>
-      </w:r>
-    </w:p>
-    <w:p>
-      <w:pPr>
-        <w:spacing w:after="0"/>
-        <w:jc w:val="both"/>
-        <w:rPr>
-          <w:sz w:val="24"/>
-          <w:szCs w:val="24"/>
-        </w:rPr>
-      </w:pPr>
+        <w:tab/>
+      </w:r>
+      <w:r>
+        <w:rPr>
+          <w:sz w:val="24"/>
+          <w:szCs w:val="24"/>
+        </w:rPr>
+        <w:tab/>
+      </w:r>
+      <w:r>
+        <w:rPr>
+          <w:sz w:val="24"/>
+          <w:szCs w:val="24"/>
+        </w:rPr>
+        <w:tab/>
+      </w:r>
+      <w:r>
+        <w:rPr>
+          <w:sz w:val="24"/>
+          <w:szCs w:val="24"/>
+        </w:rPr>
+        <w:tab/>
+      </w:r>
+      <w:r>
+        <w:rPr>
+          <w:sz w:val="24"/>
+          <w:szCs w:val="24"/>
+        </w:rPr>
+        <w:tab/>
+      </w:r>
+      <w:r>
+        <w:rPr>
+          <w:sz w:val="24"/>
+          <w:szCs w:val="24"/>
+        </w:rPr>
+        <w:tab/>
+      </w:r>
+      <w:r>
+        <w:rPr>
+          <w:sz w:val="24"/>
+          <w:szCs w:val="24"/>
+        </w:rPr>
+        <w:tab/>
+        <w:t xml:space="preserve">       </w:t>
+      </w:r>
+      <w:r>
+        <w:rPr>
+          <w:sz w:val="24"/>
+          <w:szCs w:val="24"/>
+        </w:rPr>
+        <w:t>(2018 – 2019)</w:t>
+      </w:r>
     </w:p>
     <w:p>
       <w:pPr>
@@ -565,6 +349,674 @@
           <w:szCs w:val="24"/>
           <w:u w:val="single"/>
         </w:rPr>
+        <w:t>S</w:t>
+      </w:r>
+      <w:r>
+        <w:rPr>
+          <w:b/>
+          <w:sz w:val="32"/>
+          <w:szCs w:val="24"/>
+          <w:u w:val="single"/>
+        </w:rPr>
+        <w:t xml:space="preserve">kills </w:t>
+      </w:r>
+    </w:p>
+    <w:p>
+      <w:pPr>
+        <w:spacing w:after="0"/>
+        <w:rPr>
+          <w:sz w:val="24"/>
+          <w:szCs w:val="24"/>
+        </w:rPr>
+      </w:pPr>
+      <w:r>
+        <w:rPr>
+          <w:sz w:val="24"/>
+          <w:szCs w:val="24"/>
+        </w:rPr>
+        <w:t xml:space="preserve">Programming – </w:t>
+      </w:r>
+      <w:r>
+        <w:rPr>
+          <w:b/>
+          <w:sz w:val="24"/>
+          <w:szCs w:val="24"/>
+        </w:rPr>
+        <w:t>C/C++ (500+ DSA solved)|C# (.NET)|JavaScript|Python|Java</w:t>
+      </w:r>
+      <w:r>
+        <w:rPr>
+          <w:sz w:val="24"/>
+          <w:szCs w:val="24"/>
+        </w:rPr>
+        <w:t xml:space="preserve"> </w:t>
+      </w:r>
+    </w:p>
+    <w:p>
+      <w:pPr>
+        <w:spacing w:after="0"/>
+        <w:rPr>
+          <w:b/>
+          <w:sz w:val="24"/>
+          <w:szCs w:val="24"/>
+        </w:rPr>
+      </w:pPr>
+      <w:r>
+        <w:rPr>
+          <w:sz w:val="24"/>
+          <w:szCs w:val="24"/>
+        </w:rPr>
+        <w:t xml:space="preserve">Database – </w:t>
+      </w:r>
+      <w:r>
+        <w:rPr>
+          <w:b/>
+          <w:sz w:val="24"/>
+          <w:szCs w:val="24"/>
+        </w:rPr>
+        <w:t xml:space="preserve">MySql|SqlServer|MongoDb </w:t>
+      </w:r>
+    </w:p>
+    <w:p>
+      <w:pPr>
+        <w:spacing w:after="0"/>
+        <w:rPr>
+          <w:sz w:val="24"/>
+          <w:szCs w:val="24"/>
+        </w:rPr>
+      </w:pPr>
+      <w:r>
+        <w:rPr>
+          <w:sz w:val="24"/>
+          <w:szCs w:val="24"/>
+        </w:rPr>
+        <w:t xml:space="preserve">Technology/Frameworks </w:t>
+      </w:r>
+      <w:r>
+        <w:rPr>
+          <w:b/>
+          <w:sz w:val="24"/>
+          <w:szCs w:val="24"/>
+        </w:rPr>
+        <w:t>– HTML/CSS/JS|MERN stack|ASP.NET/C#|Django</w:t>
+      </w:r>
+      <w:r>
+        <w:rPr>
+          <w:sz w:val="24"/>
+          <w:szCs w:val="24"/>
+        </w:rPr>
+        <w:t xml:space="preserve"> </w:t>
+      </w:r>
+    </w:p>
+    <w:p>
+      <w:pPr>
+        <w:spacing w:after="0"/>
+        <w:rPr>
+          <w:sz w:val="24"/>
+          <w:szCs w:val="24"/>
+        </w:rPr>
+      </w:pPr>
+      <w:r>
+        <w:rPr>
+          <w:sz w:val="24"/>
+          <w:szCs w:val="24"/>
+        </w:rPr>
+        <w:t xml:space="preserve">Tools </w:t>
+      </w:r>
+      <w:r>
+        <w:rPr>
+          <w:b/>
+          <w:sz w:val="24"/>
+          <w:szCs w:val="24"/>
+        </w:rPr>
+        <w:t>– Postman|Google Cloud|Git|Github|Docker|Firebase|Jupyter Notebook</w:t>
+      </w:r>
+      <w:r>
+        <w:rPr>
+          <w:sz w:val="24"/>
+          <w:szCs w:val="24"/>
+        </w:rPr>
+        <w:t xml:space="preserve"> </w:t>
+      </w:r>
+    </w:p>
+    <w:p>
+      <w:pPr>
+        <w:spacing w:after="240"/>
+        <w:rPr>
+          <w:b/>
+          <w:sz w:val="24"/>
+          <w:szCs w:val="24"/>
+        </w:rPr>
+      </w:pPr>
+      <w:r>
+        <w:rPr>
+          <w:sz w:val="24"/>
+          <w:szCs w:val="24"/>
+        </w:rPr>
+        <w:t xml:space="preserve">Computer Fundamentals – </w:t>
+      </w:r>
+      <w:r>
+        <w:rPr>
+          <w:b/>
+          <w:sz w:val="24"/>
+          <w:szCs w:val="24"/>
+        </w:rPr>
+        <w:t>OOP|DBMS|Computer Networks|Operating System</w:t>
+      </w:r>
+      <w:r>
+        <w:rPr>
+          <w:b/>
+          <w:sz w:val="24"/>
+          <w:szCs w:val="24"/>
+        </w:rPr>
+        <w:t>|Clean Code</w:t>
+      </w:r>
+    </w:p>
+    <w:p>
+      <w:pPr>
+        <w:spacing w:after="0"/>
+        <w:rPr>
+          <w:b/>
+          <w:sz w:val="32"/>
+          <w:szCs w:val="24"/>
+          <w:u w:val="single"/>
+        </w:rPr>
+      </w:pPr>
+      <w:r>
+        <w:rPr>
+          <w:b/>
+          <w:sz w:val="32"/>
+          <w:szCs w:val="24"/>
+          <w:u w:val="single"/>
+        </w:rPr>
+        <w:t>Full-Time Experience</w:t>
+      </w:r>
+    </w:p>
+    <w:p>
+      <w:pPr>
+        <w:spacing w:after="0"/>
+        <w:rPr>
+          <w:sz w:val="24"/>
+          <w:szCs w:val="24"/>
+        </w:rPr>
+      </w:pPr>
+      <w:r>
+        <w:rPr>
+          <w:b/>
+          <w:sz w:val="24"/>
+          <w:szCs w:val="24"/>
+        </w:rPr>
+        <w:t xml:space="preserve">-Cognizant Technology Solution </w:t>
+      </w:r>
+      <w:r>
+        <w:rPr>
+          <w:b/>
+          <w:sz w:val="24"/>
+          <w:szCs w:val="24"/>
+        </w:rPr>
+        <w:t xml:space="preserve">                                                                                                           </w:t>
+      </w:r>
+      <w:r>
+        <w:rPr>
+          <w:b/>
+          <w:sz w:val="24"/>
+          <w:szCs w:val="24"/>
+        </w:rPr>
+        <w:t>(Nov 2025 – Present)</w:t>
+      </w:r>
+    </w:p>
+    <w:p>
+      <w:pPr>
+        <w:spacing w:after="0"/>
+        <w:rPr>
+          <w:sz w:val="24"/>
+          <w:szCs w:val="24"/>
+        </w:rPr>
+      </w:pPr>
+      <w:r>
+        <w:rPr>
+          <w:sz w:val="24"/>
+          <w:szCs w:val="24"/>
+        </w:rPr>
+        <w:t>1.</w:t>
+      </w:r>
+      <w:r>
+        <w:rPr>
+          <w:sz w:val="24"/>
+          <w:szCs w:val="24"/>
+        </w:rPr>
+        <w:t xml:space="preserve">  Worked on the </w:t>
+      </w:r>
+      <w:r>
+        <w:rPr>
+          <w:b/>
+          <w:bCs/>
+          <w:sz w:val="24"/>
+          <w:szCs w:val="24"/>
+        </w:rPr>
+        <w:t>CHUBB Insurance domain</w:t>
+      </w:r>
+      <w:r>
+        <w:rPr>
+          <w:sz w:val="24"/>
+          <w:szCs w:val="24"/>
+        </w:rPr>
+        <w:t xml:space="preserve"> in a </w:t>
+      </w:r>
+      <w:r>
+        <w:rPr>
+          <w:b/>
+          <w:bCs/>
+          <w:sz w:val="24"/>
+          <w:szCs w:val="24"/>
+        </w:rPr>
+        <w:t>Production Support role</w:t>
+      </w:r>
+      <w:r>
+        <w:rPr>
+          <w:sz w:val="24"/>
+          <w:szCs w:val="24"/>
+        </w:rPr>
+        <w:t xml:space="preserve">, utilizing </w:t>
+      </w:r>
+      <w:r>
+        <w:rPr>
+          <w:b/>
+          <w:bCs/>
+          <w:sz w:val="24"/>
+          <w:szCs w:val="24"/>
+        </w:rPr>
+        <w:t>C#, SQL Server, ServiceNow</w:t>
+      </w:r>
+      <w:r>
+        <w:rPr>
+          <w:sz w:val="24"/>
+          <w:szCs w:val="24"/>
+        </w:rPr>
+        <w:t xml:space="preserve">, and </w:t>
+      </w:r>
+      <w:r>
+        <w:rPr>
+          <w:b/>
+          <w:bCs/>
+          <w:sz w:val="24"/>
+          <w:szCs w:val="24"/>
+        </w:rPr>
+        <w:t>enterprise tools</w:t>
+      </w:r>
+      <w:r>
+        <w:rPr>
+          <w:sz w:val="24"/>
+          <w:szCs w:val="24"/>
+        </w:rPr>
+        <w:t xml:space="preserve"> to analyze issues, understand complex codebases, and deliver </w:t>
+      </w:r>
+      <w:r>
+        <w:rPr>
+          <w:b/>
+          <w:bCs/>
+          <w:sz w:val="24"/>
+          <w:szCs w:val="24"/>
+        </w:rPr>
+        <w:t>production-ready fixes</w:t>
+      </w:r>
+      <w:r>
+        <w:rPr>
+          <w:sz w:val="24"/>
+          <w:szCs w:val="24"/>
+        </w:rPr>
+        <w:t>.</w:t>
+      </w:r>
+    </w:p>
+    <w:p>
+      <w:pPr>
+        <w:spacing w:after="0"/>
+        <w:rPr>
+          <w:sz w:val="24"/>
+          <w:szCs w:val="24"/>
+        </w:rPr>
+      </w:pPr>
+      <w:r>
+        <w:rPr>
+          <w:sz w:val="24"/>
+          <w:szCs w:val="24"/>
+        </w:rPr>
+        <w:t>2.</w:t>
+      </w:r>
+      <w:r>
+        <w:rPr>
+          <w:sz w:val="24"/>
+          <w:szCs w:val="24"/>
+        </w:rPr>
+        <w:t xml:space="preserve">  Successfully resolved </w:t>
+      </w:r>
+      <w:r>
+        <w:rPr>
+          <w:b/>
+          <w:bCs/>
+          <w:sz w:val="24"/>
+          <w:szCs w:val="24"/>
+        </w:rPr>
+        <w:t>40+ tickets</w:t>
+      </w:r>
+      <w:r>
+        <w:rPr>
+          <w:sz w:val="24"/>
+          <w:szCs w:val="24"/>
+        </w:rPr>
+        <w:t xml:space="preserve"> involving </w:t>
+      </w:r>
+      <w:r>
+        <w:rPr>
+          <w:b/>
+          <w:bCs/>
+          <w:sz w:val="24"/>
+          <w:szCs w:val="24"/>
+        </w:rPr>
+        <w:t>bug fixing, data corrections, and logic enhancements</w:t>
+      </w:r>
+      <w:r>
+        <w:rPr>
+          <w:sz w:val="24"/>
+          <w:szCs w:val="24"/>
+        </w:rPr>
+        <w:t xml:space="preserve">, ensuring </w:t>
+      </w:r>
+      <w:r>
+        <w:rPr>
+          <w:b/>
+          <w:bCs/>
+          <w:sz w:val="24"/>
+          <w:szCs w:val="24"/>
+        </w:rPr>
+        <w:t>data integrity</w:t>
+      </w:r>
+      <w:r>
+        <w:rPr>
+          <w:sz w:val="24"/>
+          <w:szCs w:val="24"/>
+        </w:rPr>
+        <w:t xml:space="preserve"> by validating </w:t>
+      </w:r>
+      <w:r>
+        <w:rPr>
+          <w:b/>
+          <w:bCs/>
+          <w:sz w:val="24"/>
+          <w:szCs w:val="24"/>
+        </w:rPr>
+        <w:t>SQL scripts across Dev, Stage, and Production environments</w:t>
+      </w:r>
+      <w:r>
+        <w:rPr>
+          <w:sz w:val="24"/>
+          <w:szCs w:val="24"/>
+        </w:rPr>
+        <w:t>.</w:t>
+      </w:r>
+    </w:p>
+    <w:p>
+      <w:pPr>
+        <w:spacing w:after="0"/>
+        <w:rPr>
+          <w:sz w:val="24"/>
+          <w:szCs w:val="24"/>
+        </w:rPr>
+      </w:pPr>
+      <w:r>
+        <w:rPr>
+          <w:sz w:val="24"/>
+          <w:szCs w:val="24"/>
+        </w:rPr>
+        <w:t>3.</w:t>
+      </w:r>
+      <w:r>
+        <w:rPr>
+          <w:sz w:val="24"/>
+          <w:szCs w:val="24"/>
+        </w:rPr>
+        <w:t xml:space="preserve">  Designed and developed </w:t>
+      </w:r>
+      <w:r>
+        <w:rPr>
+          <w:b/>
+          <w:bCs/>
+          <w:sz w:val="24"/>
+          <w:szCs w:val="24"/>
+        </w:rPr>
+        <w:t>C# console-based automation tools</w:t>
+      </w:r>
+      <w:r>
+        <w:rPr>
+          <w:sz w:val="24"/>
+          <w:szCs w:val="24"/>
+        </w:rPr>
+        <w:t xml:space="preserve"> to streamline </w:t>
+      </w:r>
+      <w:r>
+        <w:rPr>
+          <w:b/>
+          <w:bCs/>
+          <w:sz w:val="24"/>
+          <w:szCs w:val="24"/>
+        </w:rPr>
+        <w:t>data extraction, transformation, and reporting</w:t>
+      </w:r>
+      <w:r>
+        <w:rPr>
+          <w:sz w:val="24"/>
+          <w:szCs w:val="24"/>
+        </w:rPr>
+        <w:t xml:space="preserve">, reducing </w:t>
+      </w:r>
+      <w:r>
+        <w:rPr>
+          <w:b/>
+          <w:bCs/>
+          <w:sz w:val="24"/>
+          <w:szCs w:val="24"/>
+        </w:rPr>
+        <w:t>manual effort</w:t>
+      </w:r>
+      <w:r>
+        <w:rPr>
+          <w:sz w:val="24"/>
+          <w:szCs w:val="24"/>
+        </w:rPr>
+        <w:t xml:space="preserve"> and improving turnaround time by </w:t>
+      </w:r>
+      <w:r>
+        <w:rPr>
+          <w:b/>
+          <w:bCs/>
+          <w:sz w:val="24"/>
+          <w:szCs w:val="24"/>
+        </w:rPr>
+        <w:t>~15–20 minutes per ticket</w:t>
+      </w:r>
+      <w:r>
+        <w:rPr>
+          <w:sz w:val="24"/>
+          <w:szCs w:val="24"/>
+        </w:rPr>
+        <w:t>.</w:t>
+      </w:r>
+    </w:p>
+    <w:p>
+      <w:pPr>
+        <w:spacing w:after="0"/>
+        <w:rPr>
+          <w:sz w:val="24"/>
+          <w:szCs w:val="24"/>
+        </w:rPr>
+      </w:pPr>
+      <w:r>
+        <w:rPr>
+          <w:sz w:val="24"/>
+          <w:szCs w:val="24"/>
+        </w:rPr>
+        <w:t>4.</w:t>
+      </w:r>
+      <w:r>
+        <w:rPr>
+          <w:sz w:val="24"/>
+          <w:szCs w:val="24"/>
+        </w:rPr>
+        <w:t xml:space="preserve">  Applied advanced concepts such as </w:t>
+      </w:r>
+      <w:r>
+        <w:rPr>
+          <w:b/>
+          <w:bCs/>
+          <w:sz w:val="24"/>
+          <w:szCs w:val="24"/>
+        </w:rPr>
+        <w:t>Multithreading, File Handling, and Process Execution in C#</w:t>
+      </w:r>
+      <w:r>
+        <w:rPr>
+          <w:sz w:val="24"/>
+          <w:szCs w:val="24"/>
+        </w:rPr>
+        <w:t xml:space="preserve"> to build </w:t>
+      </w:r>
+      <w:r>
+        <w:rPr>
+          <w:b/>
+          <w:bCs/>
+          <w:sz w:val="24"/>
+          <w:szCs w:val="24"/>
+        </w:rPr>
+        <w:t>scalable, performance-optimized automation solutions</w:t>
+      </w:r>
+      <w:r>
+        <w:rPr>
+          <w:sz w:val="24"/>
+          <w:szCs w:val="24"/>
+        </w:rPr>
+        <w:t>.</w:t>
+      </w:r>
+    </w:p>
+    <w:p>
+      <w:pPr>
+        <w:spacing w:after="240"/>
+        <w:rPr>
+          <w:sz w:val="24"/>
+          <w:szCs w:val="24"/>
+        </w:rPr>
+      </w:pPr>
+      <w:r>
+        <w:rPr>
+          <w:sz w:val="24"/>
+          <w:szCs w:val="24"/>
+        </w:rPr>
+        <w:t>5.</w:t>
+      </w:r>
+      <w:r>
+        <w:rPr>
+          <w:sz w:val="24"/>
+          <w:szCs w:val="24"/>
+        </w:rPr>
+        <w:t xml:space="preserve">  Built </w:t>
+      </w:r>
+      <w:r>
+        <w:rPr>
+          <w:b/>
+          <w:bCs/>
+          <w:sz w:val="24"/>
+          <w:szCs w:val="24"/>
+        </w:rPr>
+        <w:t>modular and reusable utilities</w:t>
+      </w:r>
+      <w:r>
+        <w:rPr>
+          <w:sz w:val="24"/>
+          <w:szCs w:val="24"/>
+        </w:rPr>
+        <w:t xml:space="preserve"> with </w:t>
+      </w:r>
+      <w:r>
+        <w:rPr>
+          <w:b/>
+          <w:bCs/>
+          <w:sz w:val="24"/>
+          <w:szCs w:val="24"/>
+        </w:rPr>
+        <w:t>configurable presets (server, database, tables)</w:t>
+      </w:r>
+      <w:r>
+        <w:rPr>
+          <w:sz w:val="24"/>
+          <w:szCs w:val="24"/>
+        </w:rPr>
+        <w:t xml:space="preserve"> and implemented </w:t>
+      </w:r>
+      <w:r>
+        <w:rPr>
+          <w:b/>
+          <w:bCs/>
+          <w:sz w:val="24"/>
+          <w:szCs w:val="24"/>
+        </w:rPr>
+        <w:t>caching mechanisms</w:t>
+      </w:r>
+      <w:r>
+        <w:rPr>
+          <w:sz w:val="24"/>
+          <w:szCs w:val="24"/>
+        </w:rPr>
+        <w:t xml:space="preserve"> to efficiently manage </w:t>
+      </w:r>
+      <w:r>
+        <w:rPr>
+          <w:b/>
+          <w:bCs/>
+          <w:sz w:val="24"/>
+          <w:szCs w:val="24"/>
+        </w:rPr>
+        <w:t>multi-environment workflows</w:t>
+      </w:r>
+      <w:r>
+        <w:rPr>
+          <w:sz w:val="24"/>
+          <w:szCs w:val="24"/>
+        </w:rPr>
+        <w:t xml:space="preserve">, while strengthening </w:t>
+      </w:r>
+      <w:r>
+        <w:rPr>
+          <w:b/>
+          <w:bCs/>
+          <w:sz w:val="24"/>
+          <w:szCs w:val="24"/>
+        </w:rPr>
+        <w:t>DSA and modern .NET practices</w:t>
+      </w:r>
+      <w:r>
+        <w:rPr>
+          <w:sz w:val="24"/>
+          <w:szCs w:val="24"/>
+        </w:rPr>
+        <w:t>.</w:t>
+      </w:r>
+    </w:p>
+    <w:p>
+      <w:pPr>
+        <w:spacing w:after="0"/>
+        <w:rPr>
+          <w:b/>
+          <w:sz w:val="32"/>
+          <w:szCs w:val="24"/>
+          <w:u w:val="single"/>
+        </w:rPr>
+      </w:pPr>
+      <w:r>
+        <w:rPr>
+          <w:b/>
+          <w:sz w:val="32"/>
+          <w:szCs w:val="24"/>
+          <w:u w:val="single"/>
+        </w:rPr>
         <w:t>Intern</w:t>
       </w:r>
       <w:r>
@@ -670,146 +1122,285 @@
     <w:p>
       <w:pPr>
         <w:spacing w:after="0"/>
-        <w:jc w:val="both"/>
-        <w:rPr>
-          <w:sz w:val="24"/>
-          <w:szCs w:val="24"/>
-        </w:rPr>
-      </w:pPr>
-      <w:r>
-        <w:rPr>
-          <w:sz w:val="24"/>
-          <w:szCs w:val="24"/>
-        </w:rPr>
-        <w:t xml:space="preserve">    1.</w:t>
-      </w:r>
-      <w:r>
-        <w:rPr>
-          <w:sz w:val="24"/>
-          <w:szCs w:val="24"/>
-        </w:rPr>
-        <w:t xml:space="preserve">  Completed a 4-month internship focused on full-stack development using C# .NET, HTML, CSS, JavaScript, Bootstrap, Python, Linux, and SQL Server.</w:t>
-      </w:r>
-    </w:p>
-    <w:p>
-      <w:pPr>
-        <w:spacing w:after="0"/>
-        <w:jc w:val="both"/>
-        <w:rPr>
-          <w:sz w:val="24"/>
-          <w:szCs w:val="24"/>
-        </w:rPr>
-      </w:pPr>
-      <w:r>
-        <w:rPr>
-          <w:sz w:val="24"/>
-          <w:szCs w:val="24"/>
-        </w:rPr>
-        <w:t xml:space="preserve">   2.</w:t>
-      </w:r>
-      <w:r>
-        <w:rPr>
-          <w:sz w:val="24"/>
-          <w:szCs w:val="24"/>
-        </w:rPr>
-        <w:t xml:space="preserve">  Developed a full-stack web application </w:t>
-      </w:r>
-      <w:r>
-        <w:rPr>
-          <w:i/>
-          <w:iCs/>
-          <w:sz w:val="24"/>
-          <w:szCs w:val="24"/>
-        </w:rPr>
-        <w:t>“</w:t>
-      </w:r>
-      <w:r>
-        <w:rPr>
-          <w:b/>
-          <w:i/>
-          <w:iCs/>
-          <w:sz w:val="24"/>
-          <w:szCs w:val="24"/>
-        </w:rPr>
-        <w:t>Virtual Art Gallery</w:t>
-      </w:r>
-      <w:r>
-        <w:rPr>
-          <w:i/>
-          <w:iCs/>
-          <w:sz w:val="24"/>
-          <w:szCs w:val="24"/>
-        </w:rPr>
-        <w:t>”</w:t>
-      </w:r>
-      <w:r>
-        <w:rPr>
-          <w:sz w:val="24"/>
-          <w:szCs w:val="24"/>
-        </w:rPr>
-        <w:t xml:space="preserve"> integrating Cloudinary, JWT, email services, and file management tools.</w:t>
-      </w:r>
-    </w:p>
-    <w:p>
-      <w:pPr>
-        <w:spacing w:after="0"/>
-        <w:jc w:val="both"/>
-        <w:rPr>
-          <w:sz w:val="24"/>
-          <w:szCs w:val="24"/>
-        </w:rPr>
-      </w:pPr>
-      <w:r>
-        <w:rPr>
-          <w:sz w:val="24"/>
-          <w:szCs w:val="24"/>
-        </w:rPr>
-        <w:t xml:space="preserve">    3.</w:t>
-      </w:r>
-      <w:r>
-        <w:rPr>
-          <w:sz w:val="24"/>
-          <w:szCs w:val="24"/>
-        </w:rPr>
-        <w:t xml:space="preserve">  Led backend setup and implemented secure authentication with role-based authorization using access &amp; refresh token mechanisms with cookies.</w:t>
-      </w:r>
-    </w:p>
-    <w:p>
-      <w:pPr>
-        <w:spacing w:after="0"/>
-        <w:jc w:val="both"/>
-        <w:rPr>
-          <w:sz w:val="24"/>
-          <w:szCs w:val="24"/>
-        </w:rPr>
-      </w:pPr>
-      <w:r>
-        <w:rPr>
-          <w:sz w:val="24"/>
-          <w:szCs w:val="24"/>
-        </w:rPr>
-        <w:t xml:space="preserve">   4.</w:t>
-      </w:r>
-      <w:r>
-        <w:rPr>
-          <w:sz w:val="24"/>
-          <w:szCs w:val="24"/>
-        </w:rPr>
-        <w:t xml:space="preserve">  Contributed to frontend by building an interceptor for token renewal and</w:t>
-      </w:r>
-      <w:r>
-        <w:rPr>
-          <w:sz w:val="24"/>
-          <w:szCs w:val="24"/>
-        </w:rPr>
-        <w:t xml:space="preserve"> ensured scalable, maintainable </w:t>
-      </w:r>
-      <w:r>
-        <w:rPr>
-          <w:sz w:val="24"/>
-          <w:szCs w:val="24"/>
-        </w:rPr>
-        <w:t>code following clean code practices.</w:t>
+        <w:rPr>
+          <w:sz w:val="24"/>
+          <w:szCs w:val="24"/>
+        </w:rPr>
+      </w:pPr>
+      <w:r>
+        <w:rPr>
+          <w:sz w:val="24"/>
+          <w:szCs w:val="24"/>
+        </w:rPr>
+        <w:t>1.</w:t>
+      </w:r>
+      <w:r>
+        <w:rPr>
+          <w:sz w:val="24"/>
+          <w:szCs w:val="24"/>
+        </w:rPr>
+        <w:t xml:space="preserve">  Completed a </w:t>
+      </w:r>
+      <w:r>
+        <w:rPr>
+          <w:b/>
+          <w:bCs/>
+          <w:sz w:val="24"/>
+          <w:szCs w:val="24"/>
+        </w:rPr>
+        <w:t>4-month Internship in Full-Stack Development</w:t>
+      </w:r>
+      <w:r>
+        <w:rPr>
+          <w:sz w:val="24"/>
+          <w:szCs w:val="24"/>
+        </w:rPr>
+        <w:t xml:space="preserve">, working with </w:t>
+      </w:r>
+      <w:r>
+        <w:rPr>
+          <w:b/>
+          <w:bCs/>
+          <w:sz w:val="24"/>
+          <w:szCs w:val="24"/>
+        </w:rPr>
+        <w:t>C# .NET, HTML, CSS, JavaScript, Bootstrap, Python, Linux, and SQL Server</w:t>
+      </w:r>
+      <w:r>
+        <w:rPr>
+          <w:sz w:val="24"/>
+          <w:szCs w:val="24"/>
+        </w:rPr>
+        <w:t>.</w:t>
+      </w:r>
+    </w:p>
+    <w:p>
+      <w:pPr>
+        <w:spacing w:after="0"/>
+        <w:rPr>
+          <w:sz w:val="24"/>
+          <w:szCs w:val="24"/>
+        </w:rPr>
+      </w:pPr>
+      <w:r>
+        <w:rPr>
+          <w:sz w:val="24"/>
+          <w:szCs w:val="24"/>
+        </w:rPr>
+        <w:t>2.</w:t>
+      </w:r>
+      <w:r>
+        <w:rPr>
+          <w:sz w:val="24"/>
+          <w:szCs w:val="24"/>
+        </w:rPr>
+        <w:t xml:space="preserve">  Developed a </w:t>
+      </w:r>
+      <w:r>
+        <w:rPr>
+          <w:b/>
+          <w:bCs/>
+          <w:sz w:val="24"/>
+          <w:szCs w:val="24"/>
+        </w:rPr>
+        <w:t>Full-Stack Web Application – “Virtual Art Gallery”</w:t>
+      </w:r>
+      <w:r>
+        <w:rPr>
+          <w:sz w:val="24"/>
+          <w:szCs w:val="24"/>
+        </w:rPr>
+        <w:t xml:space="preserve">, integrating </w:t>
+      </w:r>
+      <w:r>
+        <w:rPr>
+          <w:b/>
+          <w:bCs/>
+          <w:sz w:val="24"/>
+          <w:szCs w:val="24"/>
+        </w:rPr>
+        <w:t>Cloudinary (file storage), JWT authentication, email services</w:t>
+      </w:r>
+      <w:r>
+        <w:rPr>
+          <w:sz w:val="24"/>
+          <w:szCs w:val="24"/>
+        </w:rPr>
+        <w:t xml:space="preserve">, and </w:t>
+      </w:r>
+      <w:r>
+        <w:rPr>
+          <w:b/>
+          <w:bCs/>
+          <w:sz w:val="24"/>
+          <w:szCs w:val="24"/>
+        </w:rPr>
+        <w:t>secure file management systems</w:t>
+      </w:r>
+      <w:r>
+        <w:rPr>
+          <w:sz w:val="24"/>
+          <w:szCs w:val="24"/>
+        </w:rPr>
+        <w:t>.</w:t>
+      </w:r>
+    </w:p>
+    <w:p>
+      <w:pPr>
+        <w:spacing w:after="0"/>
+        <w:rPr>
+          <w:sz w:val="24"/>
+          <w:szCs w:val="24"/>
+        </w:rPr>
+      </w:pPr>
+      <w:r>
+        <w:rPr>
+          <w:sz w:val="24"/>
+          <w:szCs w:val="24"/>
+        </w:rPr>
+        <w:t>3.</w:t>
+      </w:r>
+      <w:r>
+        <w:rPr>
+          <w:sz w:val="24"/>
+          <w:szCs w:val="24"/>
+        </w:rPr>
+        <w:t xml:space="preserve">  Led </w:t>
+      </w:r>
+      <w:r>
+        <w:rPr>
+          <w:b/>
+          <w:bCs/>
+          <w:sz w:val="24"/>
+          <w:szCs w:val="24"/>
+        </w:rPr>
+        <w:t>Backend Development</w:t>
+      </w:r>
+      <w:r>
+        <w:rPr>
+          <w:sz w:val="24"/>
+          <w:szCs w:val="24"/>
+        </w:rPr>
+        <w:t xml:space="preserve">, implementing </w:t>
+      </w:r>
+      <w:r>
+        <w:rPr>
+          <w:b/>
+          <w:bCs/>
+          <w:sz w:val="24"/>
+          <w:szCs w:val="24"/>
+        </w:rPr>
+        <w:t>secure authentication and Role-Based Authorization</w:t>
+      </w:r>
+      <w:r>
+        <w:rPr>
+          <w:sz w:val="24"/>
+          <w:szCs w:val="24"/>
+        </w:rPr>
+        <w:t xml:space="preserve"> using </w:t>
+      </w:r>
+      <w:r>
+        <w:rPr>
+          <w:b/>
+          <w:bCs/>
+          <w:sz w:val="24"/>
+          <w:szCs w:val="24"/>
+        </w:rPr>
+        <w:t>JWT (Access &amp; Refresh Tokens) with Cookies</w:t>
+      </w:r>
+      <w:r>
+        <w:rPr>
+          <w:sz w:val="24"/>
+          <w:szCs w:val="24"/>
+        </w:rPr>
+        <w:t>.</w:t>
+      </w:r>
+    </w:p>
+    <w:p>
+      <w:pPr>
+        <w:spacing w:after="120"/>
+        <w:rPr>
+          <w:sz w:val="24"/>
+          <w:szCs w:val="24"/>
+        </w:rPr>
+      </w:pPr>
+      <w:r>
+        <w:rPr>
+          <w:sz w:val="24"/>
+          <w:szCs w:val="24"/>
+        </w:rPr>
+        <w:t>4.</w:t>
+      </w:r>
+      <w:r>
+        <w:rPr>
+          <w:sz w:val="24"/>
+          <w:szCs w:val="24"/>
+        </w:rPr>
+        <w:t xml:space="preserve">  Contributed to </w:t>
+      </w:r>
+      <w:r>
+        <w:rPr>
+          <w:b/>
+          <w:bCs/>
+          <w:sz w:val="24"/>
+          <w:szCs w:val="24"/>
+        </w:rPr>
+        <w:t>Frontend Development</w:t>
+      </w:r>
+      <w:r>
+        <w:rPr>
+          <w:sz w:val="24"/>
+          <w:szCs w:val="24"/>
+        </w:rPr>
+        <w:t xml:space="preserve">, building </w:t>
+      </w:r>
+      <w:r>
+        <w:rPr>
+          <w:b/>
+          <w:bCs/>
+          <w:sz w:val="24"/>
+          <w:szCs w:val="24"/>
+        </w:rPr>
+        <w:t>API Interceptors for token renewal</w:t>
+      </w:r>
+      <w:r>
+        <w:rPr>
+          <w:sz w:val="24"/>
+          <w:szCs w:val="24"/>
+        </w:rPr>
+        <w:t xml:space="preserve"> and ensuring </w:t>
+      </w:r>
+      <w:r>
+        <w:rPr>
+          <w:b/>
+          <w:bCs/>
+          <w:sz w:val="24"/>
+          <w:szCs w:val="24"/>
+        </w:rPr>
+        <w:t>scalable, maintainable architecture</w:t>
+      </w:r>
+      <w:r>
+        <w:rPr>
+          <w:sz w:val="24"/>
+          <w:szCs w:val="24"/>
+        </w:rPr>
+        <w:t xml:space="preserve"> by following </w:t>
+      </w:r>
+      <w:r>
+        <w:rPr>
+          <w:b/>
+          <w:bCs/>
+          <w:sz w:val="24"/>
+          <w:szCs w:val="24"/>
+        </w:rPr>
+        <w:t>Clean Code practices</w:t>
+      </w:r>
+      <w:r>
+        <w:rPr>
+          <w:sz w:val="24"/>
+          <w:szCs w:val="24"/>
+        </w:rPr>
+        <w:t>.</w:t>
       </w:r>
     </w:p>
     <w:p>
@@ -975,160 +1566,562 @@
           <w:sz w:val="24"/>
           <w:szCs w:val="24"/>
         </w:rPr>
-        <w:t>Contributed to the development of scalable healthcare platforms using React.js, Express.js, MongoD</w:t>
-      </w:r>
-      <w:r>
-        <w:rPr>
-          <w:sz w:val="24"/>
-          <w:szCs w:val="24"/>
-        </w:rPr>
-        <w:t xml:space="preserve">B, and Google Cloud within </w:t>
-      </w:r>
-      <w:r>
-        <w:rPr>
-          <w:sz w:val="24"/>
-          <w:szCs w:val="24"/>
-        </w:rPr>
-        <w:t xml:space="preserve">a cross-functional team. Enhanced application performance by optimizing legacy code, </w:t>
-      </w:r>
-      <w:r>
-        <w:rPr>
-          <w:sz w:val="24"/>
-          <w:szCs w:val="24"/>
-        </w:rPr>
-        <w:t xml:space="preserve">debugging critical issues, and </w:t>
-      </w:r>
-      <w:r>
-        <w:rPr>
-          <w:sz w:val="24"/>
-          <w:szCs w:val="24"/>
-        </w:rPr>
-        <w:t xml:space="preserve">spearheading Google Maps API and ABDM API integrations for essential features like real-time user location and </w:t>
-      </w:r>
-      <w:r>
-        <w:rPr>
-          <w:sz w:val="24"/>
-          <w:szCs w:val="24"/>
-        </w:rPr>
-        <w:t xml:space="preserve">doctor </w:t>
-      </w:r>
-      <w:r>
-        <w:rPr>
-          <w:sz w:val="24"/>
-          <w:szCs w:val="24"/>
-        </w:rPr>
-        <w:t>registration to government systems. Led and managed complex modules—often overseeing f</w:t>
-      </w:r>
-      <w:r>
-        <w:rPr>
-          <w:sz w:val="24"/>
-          <w:szCs w:val="24"/>
-        </w:rPr>
-        <w:t xml:space="preserve">ive frontend, two backend, and </w:t>
-      </w:r>
-      <w:r>
-        <w:rPr>
-          <w:sz w:val="24"/>
-          <w:szCs w:val="24"/>
-        </w:rPr>
-        <w:t>one database component individually—ensuring project continuity during tight deadlines. Ch</w:t>
-      </w:r>
-      <w:r>
-        <w:rPr>
-          <w:sz w:val="24"/>
-          <w:szCs w:val="24"/>
-        </w:rPr>
-        <w:t xml:space="preserve">ampioned CI/CD pipeline setup, </w:t>
-      </w:r>
-      <w:r>
-        <w:rPr>
-          <w:sz w:val="24"/>
-          <w:szCs w:val="24"/>
-        </w:rPr>
-        <w:t>reducing deployment times by 40%, and managed 100+ Git/GitHub commits to support agi</w:t>
-      </w:r>
-      <w:r>
-        <w:rPr>
-          <w:sz w:val="24"/>
-          <w:szCs w:val="24"/>
-        </w:rPr>
-        <w:t xml:space="preserve">le, collaborative development. </w:t>
-      </w:r>
-      <w:r>
-        <w:rPr>
-          <w:sz w:val="24"/>
-          <w:szCs w:val="24"/>
-        </w:rPr>
-        <w:t xml:space="preserve">Actively handled devops tasks, </w:t>
-      </w:r>
+        <w:t>1.</w:t>
+      </w:r>
+      <w:r>
+        <w:rPr>
+          <w:sz w:val="24"/>
+          <w:szCs w:val="24"/>
+        </w:rPr>
+        <w:t xml:space="preserve"> </w:t>
+      </w:r>
+      <w:r>
+        <w:rPr>
+          <w:sz w:val="24"/>
+          <w:szCs w:val="24"/>
+        </w:rPr>
+        <w:t xml:space="preserve">Contributed to building </w:t>
+      </w:r>
+      <w:r>
+        <w:rPr>
+          <w:b/>
+          <w:bCs/>
+          <w:sz w:val="24"/>
+          <w:szCs w:val="24"/>
+        </w:rPr>
+        <w:t>MERN stack applications (MongoDB, Express.js, React.js, Node.js)</w:t>
+      </w:r>
+      <w:r>
+        <w:rPr>
+          <w:sz w:val="24"/>
+          <w:szCs w:val="24"/>
+        </w:rPr>
+        <w:t xml:space="preserve"> in a startup environment, owning </w:t>
+      </w:r>
+      <w:r>
+        <w:rPr>
+          <w:b/>
+          <w:bCs/>
+          <w:sz w:val="24"/>
+          <w:szCs w:val="24"/>
+        </w:rPr>
+        <w:t>system design, frontend, backend, and deployment</w:t>
+      </w:r>
+      <w:r>
+        <w:rPr>
+          <w:sz w:val="24"/>
+          <w:szCs w:val="24"/>
+        </w:rPr>
+        <w:t xml:space="preserve"> from early-stage development to MVP readiness.</w:t>
+      </w:r>
+    </w:p>
+    <w:p>
+      <w:pPr>
+        <w:spacing w:after="0"/>
+        <w:rPr>
+          <w:sz w:val="24"/>
+          <w:szCs w:val="24"/>
+        </w:rPr>
+      </w:pPr>
+      <w:r>
+        <w:rPr>
+          <w:sz w:val="24"/>
+          <w:szCs w:val="24"/>
+        </w:rPr>
+        <w:t>2.</w:t>
+      </w:r>
+      <w:r>
+        <w:rPr>
+          <w:sz w:val="24"/>
+          <w:szCs w:val="24"/>
+        </w:rPr>
+        <w:t xml:space="preserve"> Developed scalable frontend architecture using </w:t>
+      </w:r>
+      <w:r>
+        <w:rPr>
+          <w:b/>
+          <w:bCs/>
+          <w:sz w:val="24"/>
+          <w:szCs w:val="24"/>
+        </w:rPr>
+        <w:t>React.js</w:t>
+      </w:r>
+      <w:r>
+        <w:rPr>
+          <w:sz w:val="24"/>
+          <w:szCs w:val="24"/>
+        </w:rPr>
+        <w:t xml:space="preserve">, implementing </w:t>
+      </w:r>
+      <w:r>
+        <w:rPr>
+          <w:b/>
+          <w:bCs/>
+          <w:sz w:val="24"/>
+          <w:szCs w:val="24"/>
+        </w:rPr>
+        <w:t>dynamic forms, reusable components, rich text editor integration</w:t>
+      </w:r>
+      <w:r>
+        <w:rPr>
+          <w:sz w:val="24"/>
+          <w:szCs w:val="24"/>
+        </w:rPr>
+        <w:t xml:space="preserve">, and improving performance via </w:t>
+      </w:r>
+      <w:r>
+        <w:rPr>
+          <w:b/>
+          <w:bCs/>
+          <w:sz w:val="24"/>
+          <w:szCs w:val="24"/>
+        </w:rPr>
+        <w:t>client-side caching strategies</w:t>
+      </w:r>
+      <w:r>
+        <w:rPr>
+          <w:sz w:val="24"/>
+          <w:szCs w:val="24"/>
+        </w:rPr>
+        <w:t>.</w:t>
+      </w:r>
+    </w:p>
+    <w:p>
+      <w:pPr>
+        <w:spacing w:after="0"/>
+        <w:rPr>
+          <w:sz w:val="24"/>
+          <w:szCs w:val="24"/>
+        </w:rPr>
+      </w:pPr>
+      <w:r>
+        <w:rPr>
+          <w:sz w:val="24"/>
+          <w:szCs w:val="24"/>
+        </w:rPr>
+        <w:t>3.</w:t>
+      </w:r>
+      <w:r>
+        <w:rPr>
+          <w:sz w:val="24"/>
+          <w:szCs w:val="24"/>
+        </w:rPr>
+        <w:t xml:space="preserve"> Implemented </w:t>
+      </w:r>
+      <w:r>
+        <w:rPr>
+          <w:b/>
+          <w:bCs/>
+          <w:sz w:val="24"/>
+          <w:szCs w:val="24"/>
+        </w:rPr>
+        <w:t>global state management using Redux</w:t>
+      </w:r>
+      <w:r>
+        <w:rPr>
+          <w:sz w:val="24"/>
+          <w:szCs w:val="24"/>
+        </w:rPr>
+        <w:t xml:space="preserve">, including </w:t>
+      </w:r>
+      <w:r>
+        <w:rPr>
+          <w:b/>
+          <w:bCs/>
+          <w:sz w:val="24"/>
+          <w:szCs w:val="24"/>
+        </w:rPr>
+        <w:t>API interceptors and structured state handling</w:t>
+      </w:r>
+      <w:r>
+        <w:rPr>
+          <w:sz w:val="24"/>
+          <w:szCs w:val="24"/>
+        </w:rPr>
+        <w:t>, enabling scalable and maintainable frontend systems.</w:t>
+      </w:r>
+    </w:p>
+    <w:p>
+      <w:pPr>
+        <w:spacing w:after="0"/>
+        <w:rPr>
+          <w:sz w:val="24"/>
+          <w:szCs w:val="24"/>
+        </w:rPr>
+      </w:pPr>
+      <w:r>
+        <w:rPr>
+          <w:sz w:val="24"/>
+          <w:szCs w:val="24"/>
+        </w:rPr>
+        <w:t xml:space="preserve">4. </w:t>
+      </w:r>
+      <w:r>
+        <w:rPr>
+          <w:sz w:val="24"/>
+          <w:szCs w:val="24"/>
+        </w:rPr>
+        <w:t xml:space="preserve">Designed and integrated </w:t>
+      </w:r>
+      <w:r>
+        <w:rPr>
+          <w:b/>
+          <w:bCs/>
+          <w:sz w:val="24"/>
+          <w:szCs w:val="24"/>
+        </w:rPr>
+        <w:t>secure authentication systems</w:t>
+      </w:r>
+      <w:r>
+        <w:rPr>
+          <w:sz w:val="24"/>
+          <w:szCs w:val="24"/>
+        </w:rPr>
+        <w:t xml:space="preserve"> using </w:t>
+      </w:r>
+      <w:r>
+        <w:rPr>
+          <w:b/>
+          <w:bCs/>
+          <w:sz w:val="24"/>
+          <w:szCs w:val="24"/>
+        </w:rPr>
+        <w:t>JWT (access &amp; refresh tokens), cookies, OTP (Twilio), and OAuth (Google, Facebook)</w:t>
+      </w:r>
+      <w:r>
+        <w:rPr>
+          <w:sz w:val="24"/>
+          <w:szCs w:val="24"/>
+        </w:rPr>
+        <w:t xml:space="preserve"> with a focus on </w:t>
+      </w:r>
+      <w:r>
+        <w:rPr>
+          <w:b/>
+          <w:bCs/>
+          <w:sz w:val="24"/>
+          <w:szCs w:val="24"/>
+        </w:rPr>
+        <w:t>cost optimization for MVP stage</w:t>
+      </w:r>
+      <w:r>
+        <w:rPr>
+          <w:sz w:val="24"/>
+          <w:szCs w:val="24"/>
+        </w:rPr>
+        <w:t>.</w:t>
+      </w:r>
+    </w:p>
+    <w:p>
+      <w:pPr>
+        <w:spacing w:after="0"/>
+        <w:rPr>
+          <w:sz w:val="24"/>
+          <w:szCs w:val="24"/>
+        </w:rPr>
+      </w:pPr>
       <w:r>
         <w:rPr>
           <w:sz w:val="24"/>
           <w:szCs w:val="24"/>
         </w:rPr>
         <w:lastRenderedPageBreak/>
-        <w:t>supervised junior contributors, and authored documentatio</w:t>
-      </w:r>
-      <w:r>
-        <w:rPr>
-          <w:sz w:val="24"/>
-          <w:szCs w:val="24"/>
-        </w:rPr>
-        <w:t xml:space="preserve">n for efficient onboarding and </w:t>
-      </w:r>
-      <w:r>
-        <w:rPr>
-          <w:sz w:val="24"/>
-          <w:szCs w:val="24"/>
-        </w:rPr>
-        <w:t xml:space="preserve">onboarding. Maintained continuous quality by conducting code reviews and adapting to changing requirements, resulting in </w:t>
-      </w:r>
-    </w:p>
-    <w:p>
-      <w:pPr>
-        <w:spacing w:after="0"/>
-        <w:rPr>
-          <w:sz w:val="24"/>
-          <w:szCs w:val="24"/>
-        </w:rPr>
-      </w:pPr>
-      <w:r>
-        <w:rPr>
-          <w:sz w:val="24"/>
-          <w:szCs w:val="24"/>
-        </w:rPr>
-        <w:t xml:space="preserve">a 30% performance boost and 60% better user experience. Remain a key contributor, supporting ongoing feature </w:t>
-      </w:r>
-    </w:p>
-    <w:p>
-      <w:pPr>
-        <w:spacing w:after="120"/>
-        <w:rPr>
-          <w:sz w:val="24"/>
-          <w:szCs w:val="24"/>
-        </w:rPr>
-      </w:pPr>
-      <w:r>
-        <w:rPr>
-          <w:sz w:val="24"/>
-          <w:szCs w:val="24"/>
-        </w:rPr>
-        <w:t>advancements and ensuring reliable</w:t>
-      </w:r>
-      <w:r>
-        <w:rPr>
-          <w:sz w:val="24"/>
-          <w:szCs w:val="24"/>
-        </w:rPr>
-        <w:t xml:space="preserve"> </w:t>
-      </w:r>
-      <w:r>
-        <w:rPr>
-          <w:sz w:val="24"/>
-          <w:szCs w:val="24"/>
-        </w:rPr>
-        <w:t>, scalable solutions.</w:t>
-      </w:r>
+        <w:t xml:space="preserve"> 5. </w:t>
+      </w:r>
+      <w:r>
+        <w:rPr>
+          <w:sz w:val="24"/>
+          <w:szCs w:val="24"/>
+        </w:rPr>
+        <w:t xml:space="preserve">Engineered </w:t>
+      </w:r>
+      <w:r>
+        <w:rPr>
+          <w:b/>
+          <w:bCs/>
+          <w:sz w:val="24"/>
+          <w:szCs w:val="24"/>
+        </w:rPr>
+        <w:t>100+ RESTful APIs</w:t>
+      </w:r>
+      <w:r>
+        <w:rPr>
+          <w:sz w:val="24"/>
+          <w:szCs w:val="24"/>
+        </w:rPr>
+        <w:t xml:space="preserve"> using </w:t>
+      </w:r>
+      <w:r>
+        <w:rPr>
+          <w:b/>
+          <w:bCs/>
+          <w:sz w:val="24"/>
+          <w:szCs w:val="24"/>
+        </w:rPr>
+        <w:t>Node.js &amp; Express</w:t>
+      </w:r>
+      <w:r>
+        <w:rPr>
+          <w:sz w:val="24"/>
+          <w:szCs w:val="24"/>
+        </w:rPr>
+        <w:t xml:space="preserve">, covering </w:t>
+      </w:r>
+      <w:r>
+        <w:rPr>
+          <w:b/>
+          <w:bCs/>
+          <w:sz w:val="24"/>
+          <w:szCs w:val="24"/>
+        </w:rPr>
+        <w:t>business logic, middleware, validation (Joi), file handling (Multer), and third-party integrations</w:t>
+      </w:r>
+      <w:r>
+        <w:rPr>
+          <w:sz w:val="24"/>
+          <w:szCs w:val="24"/>
+        </w:rPr>
+        <w:t xml:space="preserve"> including </w:t>
+      </w:r>
+      <w:r>
+        <w:rPr>
+          <w:b/>
+          <w:bCs/>
+          <w:sz w:val="24"/>
+          <w:szCs w:val="24"/>
+        </w:rPr>
+        <w:t>Google Maps APIs</w:t>
+      </w:r>
+      <w:r>
+        <w:rPr>
+          <w:sz w:val="24"/>
+          <w:szCs w:val="24"/>
+        </w:rPr>
+        <w:t>.</w:t>
+      </w:r>
+    </w:p>
+    <w:p>
+      <w:pPr>
+        <w:spacing w:after="0"/>
+        <w:rPr>
+          <w:sz w:val="24"/>
+          <w:szCs w:val="24"/>
+        </w:rPr>
+      </w:pPr>
+      <w:r>
+        <w:rPr>
+          <w:sz w:val="24"/>
+          <w:szCs w:val="24"/>
+        </w:rPr>
+        <w:t xml:space="preserve">6. </w:t>
+      </w:r>
+      <w:r>
+        <w:rPr>
+          <w:sz w:val="24"/>
+          <w:szCs w:val="24"/>
+        </w:rPr>
+        <w:t xml:space="preserve">Led integration of complex </w:t>
+      </w:r>
+      <w:r>
+        <w:rPr>
+          <w:b/>
+          <w:bCs/>
+          <w:sz w:val="24"/>
+          <w:szCs w:val="24"/>
+        </w:rPr>
+        <w:t>Government Healthcare APIs (ABDM/ABHA/HPR/HFR)</w:t>
+      </w:r>
+      <w:r>
+        <w:rPr>
+          <w:sz w:val="24"/>
+          <w:szCs w:val="24"/>
+        </w:rPr>
+        <w:t xml:space="preserve">, working with </w:t>
+      </w:r>
+      <w:r>
+        <w:rPr>
+          <w:b/>
+          <w:bCs/>
+          <w:sz w:val="24"/>
+          <w:szCs w:val="24"/>
+        </w:rPr>
+        <w:t>limited documentation and evolving standards</w:t>
+      </w:r>
+      <w:r>
+        <w:rPr>
+          <w:sz w:val="24"/>
+          <w:szCs w:val="24"/>
+        </w:rPr>
+        <w:t xml:space="preserve">, redesigning </w:t>
+      </w:r>
+      <w:r>
+        <w:rPr>
+          <w:b/>
+          <w:bCs/>
+          <w:sz w:val="24"/>
+          <w:szCs w:val="24"/>
+        </w:rPr>
+        <w:t>database schemas and backend workflows</w:t>
+      </w:r>
+      <w:r>
+        <w:rPr>
+          <w:sz w:val="24"/>
+          <w:szCs w:val="24"/>
+        </w:rPr>
+        <w:t xml:space="preserve"> to ensure compliance, reliability, and seamless data exchange across systems.</w:t>
+      </w:r>
+    </w:p>
+    <w:p>
+      <w:pPr>
+        <w:spacing w:after="0"/>
+        <w:rPr>
+          <w:sz w:val="24"/>
+          <w:szCs w:val="24"/>
+        </w:rPr>
+      </w:pPr>
+      <w:r>
+        <w:rPr>
+          <w:sz w:val="24"/>
+          <w:szCs w:val="24"/>
+        </w:rPr>
+        <w:t xml:space="preserve">7. </w:t>
+      </w:r>
+      <w:r>
+        <w:rPr>
+          <w:sz w:val="24"/>
+          <w:szCs w:val="24"/>
+        </w:rPr>
+        <w:t xml:space="preserve">Redesigned and managed </w:t>
+      </w:r>
+      <w:r>
+        <w:rPr>
+          <w:b/>
+          <w:bCs/>
+          <w:sz w:val="24"/>
+          <w:szCs w:val="24"/>
+        </w:rPr>
+        <w:t>MongoDB database architecture</w:t>
+      </w:r>
+      <w:r>
+        <w:rPr>
+          <w:sz w:val="24"/>
+          <w:szCs w:val="24"/>
+        </w:rPr>
+        <w:t xml:space="preserve">, creating </w:t>
+      </w:r>
+      <w:r>
+        <w:rPr>
+          <w:b/>
+          <w:bCs/>
+          <w:sz w:val="24"/>
+          <w:szCs w:val="24"/>
+        </w:rPr>
+        <w:t>ER diagrams, scalable schemas, and handling data migration &amp; multi-database management</w:t>
+      </w:r>
+      <w:r>
+        <w:rPr>
+          <w:sz w:val="24"/>
+          <w:szCs w:val="24"/>
+        </w:rPr>
+        <w:t xml:space="preserve"> using </w:t>
+      </w:r>
+      <w:r>
+        <w:rPr>
+          <w:b/>
+          <w:bCs/>
+          <w:sz w:val="24"/>
+          <w:szCs w:val="24"/>
+        </w:rPr>
+        <w:t>MongoDB Atlas</w:t>
+      </w:r>
+      <w:r>
+        <w:rPr>
+          <w:sz w:val="24"/>
+          <w:szCs w:val="24"/>
+        </w:rPr>
+        <w:t>.</w:t>
+      </w:r>
+    </w:p>
+    <w:p>
+      <w:pPr>
+        <w:spacing w:after="0"/>
+        <w:rPr>
+          <w:sz w:val="24"/>
+          <w:szCs w:val="24"/>
+        </w:rPr>
+      </w:pPr>
+      <w:r>
+        <w:rPr>
+          <w:sz w:val="24"/>
+          <w:szCs w:val="24"/>
+        </w:rPr>
+        <w:t xml:space="preserve">8. </w:t>
+      </w:r>
+      <w:r>
+        <w:rPr>
+          <w:sz w:val="24"/>
+          <w:szCs w:val="24"/>
+        </w:rPr>
+        <w:t xml:space="preserve">Mentored and guided </w:t>
+      </w:r>
+      <w:r>
+        <w:rPr>
+          <w:b/>
+          <w:bCs/>
+          <w:sz w:val="24"/>
+          <w:szCs w:val="24"/>
+        </w:rPr>
+        <w:t>6 interns</w:t>
+      </w:r>
+      <w:r>
+        <w:rPr>
+          <w:sz w:val="24"/>
+          <w:szCs w:val="24"/>
+        </w:rPr>
+        <w:t xml:space="preserve">, while contributing to infrastructure migration from </w:t>
+      </w:r>
+      <w:r>
+        <w:rPr>
+          <w:b/>
+          <w:bCs/>
+          <w:sz w:val="24"/>
+          <w:szCs w:val="24"/>
+        </w:rPr>
+        <w:t>Railway/Vercel to Google Cloud (App Engine, Cloud Build, Docker)</w:t>
+      </w:r>
+      <w:r>
+        <w:rPr>
+          <w:sz w:val="24"/>
+          <w:szCs w:val="24"/>
+        </w:rPr>
+        <w:t xml:space="preserve">, gaining hands-on experience in </w:t>
+      </w:r>
+      <w:r>
+        <w:rPr>
+          <w:b/>
+          <w:bCs/>
+          <w:sz w:val="24"/>
+          <w:szCs w:val="24"/>
+        </w:rPr>
+        <w:t>DevOps and CI/CD pipelines</w:t>
+      </w:r>
+      <w:r>
+        <w:rPr>
+          <w:sz w:val="24"/>
+          <w:szCs w:val="24"/>
+        </w:rPr>
+        <w:t>.</w:t>
+      </w:r>
+    </w:p>
+    <w:p>
+      <w:pPr>
+        <w:spacing w:after="0"/>
+        <w:jc w:val="both"/>
+        <w:rPr>
+          <w:sz w:val="24"/>
+          <w:szCs w:val="24"/>
+        </w:rPr>
+      </w:pPr>
     </w:p>
     <w:p>
       <w:pPr>
@@ -1182,75 +2175,222 @@
     </w:p>
     <w:p>
       <w:pPr>
+        <w:spacing w:after="0"/>
+        <w:rPr>
+          <w:sz w:val="24"/>
+          <w:szCs w:val="24"/>
+        </w:rPr>
+      </w:pPr>
+      <w:r>
+        <w:rPr>
+          <w:sz w:val="24"/>
+          <w:szCs w:val="24"/>
+        </w:rPr>
+        <w:t>1.</w:t>
+      </w:r>
+      <w:r>
+        <w:rPr>
+          <w:sz w:val="24"/>
+          <w:szCs w:val="24"/>
+        </w:rPr>
+        <w:t xml:space="preserve">  Mentored under a </w:t>
+      </w:r>
+      <w:r>
+        <w:rPr>
+          <w:b/>
+          <w:bCs/>
+          <w:sz w:val="24"/>
+          <w:szCs w:val="24"/>
+        </w:rPr>
+        <w:t>Senior Software Developer (15+ years experience)</w:t>
+      </w:r>
+      <w:r>
+        <w:rPr>
+          <w:sz w:val="24"/>
+          <w:szCs w:val="24"/>
+        </w:rPr>
+        <w:t xml:space="preserve">, gaining strong understanding of </w:t>
+      </w:r>
+      <w:r>
+        <w:rPr>
+          <w:b/>
+          <w:bCs/>
+          <w:sz w:val="24"/>
+          <w:szCs w:val="24"/>
+        </w:rPr>
+        <w:t>software development mindset, scalable system design, and problem-solving approaches</w:t>
+      </w:r>
+      <w:r>
+        <w:rPr>
+          <w:sz w:val="24"/>
+          <w:szCs w:val="24"/>
+        </w:rPr>
+        <w:t>.</w:t>
+      </w:r>
+    </w:p>
+    <w:p>
+      <w:pPr>
+        <w:spacing w:after="0"/>
+        <w:rPr>
+          <w:sz w:val="24"/>
+          <w:szCs w:val="24"/>
+        </w:rPr>
+      </w:pPr>
+      <w:r>
+        <w:rPr>
+          <w:sz w:val="24"/>
+          <w:szCs w:val="24"/>
+        </w:rPr>
+        <w:t>2.</w:t>
+      </w:r>
+      <w:r>
+        <w:rPr>
+          <w:sz w:val="24"/>
+          <w:szCs w:val="24"/>
+        </w:rPr>
+        <w:t xml:space="preserve">  Trained through </w:t>
+      </w:r>
+      <w:r>
+        <w:rPr>
+          <w:b/>
+          <w:bCs/>
+          <w:sz w:val="24"/>
+          <w:szCs w:val="24"/>
+        </w:rPr>
+        <w:t>real-world case studies and production-level issues</w:t>
+      </w:r>
+      <w:r>
+        <w:rPr>
+          <w:sz w:val="24"/>
+          <w:szCs w:val="24"/>
+        </w:rPr>
+        <w:t xml:space="preserve">, analyzing </w:t>
+      </w:r>
+      <w:r>
+        <w:rPr>
+          <w:b/>
+          <w:bCs/>
+          <w:sz w:val="24"/>
+          <w:szCs w:val="24"/>
+        </w:rPr>
+        <w:t>root causes and proposing effective solutions</w:t>
+      </w:r>
+      <w:r>
+        <w:rPr>
+          <w:sz w:val="24"/>
+          <w:szCs w:val="24"/>
+        </w:rPr>
+        <w:t xml:space="preserve"> to improve system reliability.</w:t>
+      </w:r>
+    </w:p>
+    <w:p>
+      <w:pPr>
+        <w:spacing w:after="0"/>
+        <w:rPr>
+          <w:sz w:val="24"/>
+          <w:szCs w:val="24"/>
+        </w:rPr>
+      </w:pPr>
+      <w:r>
+        <w:rPr>
+          <w:sz w:val="24"/>
+          <w:szCs w:val="24"/>
+        </w:rPr>
+        <w:t>3.</w:t>
+      </w:r>
+      <w:r>
+        <w:rPr>
+          <w:sz w:val="24"/>
+          <w:szCs w:val="24"/>
+        </w:rPr>
+        <w:t xml:space="preserve">  Gained exposure to </w:t>
+      </w:r>
+      <w:r>
+        <w:rPr>
+          <w:b/>
+          <w:bCs/>
+          <w:sz w:val="24"/>
+          <w:szCs w:val="24"/>
+        </w:rPr>
+        <w:t>modern tech stack including React, Python (Django), DynamoDB, and AWS</w:t>
+      </w:r>
+      <w:r>
+        <w:rPr>
+          <w:sz w:val="24"/>
+          <w:szCs w:val="24"/>
+        </w:rPr>
+        <w:t xml:space="preserve">, understanding </w:t>
+      </w:r>
+      <w:r>
+        <w:rPr>
+          <w:b/>
+          <w:bCs/>
+          <w:sz w:val="24"/>
+          <w:szCs w:val="24"/>
+        </w:rPr>
+        <w:t>end-to-end development and deployment workflows</w:t>
+      </w:r>
+      <w:r>
+        <w:rPr>
+          <w:sz w:val="24"/>
+          <w:szCs w:val="24"/>
+        </w:rPr>
+        <w:t>.</w:t>
+      </w:r>
+    </w:p>
+    <w:p>
+      <w:pPr>
         <w:spacing w:after="240"/>
-        <w:jc w:val="both"/>
-        <w:rPr>
-          <w:sz w:val="24"/>
-          <w:szCs w:val="24"/>
-        </w:rPr>
-      </w:pPr>
-      <w:r>
-        <w:rPr>
-          <w:sz w:val="24"/>
-          <w:szCs w:val="24"/>
-        </w:rPr>
-        <w:t>Observed and troubleshot 50+ technical issues, reducing system downtime by 25% through proactive monitoring and maintenance. Integrated 3+ third-party APIs, expanding platform functionality and enabling s</w:t>
-      </w:r>
-      <w:r>
-        <w:rPr>
-          <w:sz w:val="24"/>
-          <w:szCs w:val="24"/>
-        </w:rPr>
-        <w:t xml:space="preserve">eamless data flow for enhanced </w:t>
-      </w:r>
-      <w:r>
-        <w:rPr>
-          <w:sz w:val="24"/>
-          <w:szCs w:val="24"/>
-        </w:rPr>
-        <w:t>user experience. Improved website performance by 20% using front-end optimization and lazy lo</w:t>
-      </w:r>
-      <w:r>
-        <w:rPr>
-          <w:sz w:val="24"/>
-          <w:szCs w:val="24"/>
-        </w:rPr>
-        <w:t xml:space="preserve">ading techniques, resulting in </w:t>
-      </w:r>
-      <w:r>
-        <w:rPr>
-          <w:sz w:val="24"/>
-          <w:szCs w:val="24"/>
-        </w:rPr>
-        <w:t>faster load times and greater user engagement. Collaborated with cross-functional teams to e</w:t>
-      </w:r>
-      <w:r>
-        <w:rPr>
-          <w:sz w:val="24"/>
-          <w:szCs w:val="24"/>
-        </w:rPr>
-        <w:t xml:space="preserve">liminate workflow bottlenecks, </w:t>
-      </w:r>
-      <w:r>
-        <w:rPr>
-          <w:sz w:val="24"/>
-          <w:szCs w:val="24"/>
-        </w:rPr>
-        <w:t>ensuring on-time project delivery. Conducted comprehensive code reviews and championed best practices, leading to a 15% reduction in bugs and improved code quality. Spearheaded migration of legacy systems to modern frameworks, driving advancements in scalability and maintainability while reducing operational costs by 10%. Demon</w:t>
-      </w:r>
-      <w:r>
-        <w:rPr>
-          <w:sz w:val="24"/>
-          <w:szCs w:val="24"/>
-        </w:rPr>
-        <w:t xml:space="preserve">strated strong problem-solving </w:t>
-      </w:r>
-      <w:r>
-        <w:rPr>
-          <w:sz w:val="24"/>
-          <w:szCs w:val="24"/>
-        </w:rPr>
-        <w:t xml:space="preserve">skills, adaptability, and a growth mindset instrumental to project and business outcomes. </w:t>
+        <w:rPr>
+          <w:sz w:val="24"/>
+          <w:szCs w:val="24"/>
+        </w:rPr>
+      </w:pPr>
+      <w:r>
+        <w:rPr>
+          <w:sz w:val="24"/>
+          <w:szCs w:val="24"/>
+        </w:rPr>
+        <w:t>4,</w:t>
+      </w:r>
+      <w:r>
+        <w:rPr>
+          <w:sz w:val="24"/>
+          <w:szCs w:val="24"/>
+        </w:rPr>
+        <w:t xml:space="preserve">  Built a </w:t>
+      </w:r>
+      <w:r>
+        <w:rPr>
+          <w:b/>
+          <w:bCs/>
+          <w:sz w:val="24"/>
+          <w:szCs w:val="24"/>
+        </w:rPr>
+        <w:t>full-stack MERN application (MongoDB, Express.js, React.js, Node.js)</w:t>
+      </w:r>
+      <w:r>
+        <w:rPr>
+          <w:sz w:val="24"/>
+          <w:szCs w:val="24"/>
+        </w:rPr>
+        <w:t xml:space="preserve">, applying </w:t>
+      </w:r>
+      <w:r>
+        <w:rPr>
+          <w:b/>
+          <w:bCs/>
+          <w:sz w:val="24"/>
+          <w:szCs w:val="24"/>
+        </w:rPr>
+        <w:t>clean coding practices, modular architecture, and scalability principles</w:t>
+      </w:r>
+      <w:r>
+        <w:rPr>
+          <w:sz w:val="24"/>
+          <w:szCs w:val="24"/>
+        </w:rPr>
+        <w:t>, while increasing project complexity to deepen practical knowledge.</w:t>
       </w:r>
     </w:p>
     <w:p>
@@ -1347,6 +2487,93 @@
     </w:p>
     <w:p>
       <w:pPr>
+        <w:spacing w:after="0"/>
+        <w:rPr>
+          <w:sz w:val="24"/>
+          <w:szCs w:val="24"/>
+        </w:rPr>
+      </w:pPr>
+      <w:r>
+        <w:rPr>
+          <w:sz w:val="24"/>
+          <w:szCs w:val="24"/>
+        </w:rPr>
+        <w:t>1.</w:t>
+      </w:r>
+      <w:r>
+        <w:rPr>
+          <w:sz w:val="24"/>
+          <w:szCs w:val="24"/>
+        </w:rPr>
+        <w:t xml:space="preserve">  Built </w:t>
+      </w:r>
+      <w:r>
+        <w:rPr>
+          <w:b/>
+          <w:bCs/>
+          <w:sz w:val="24"/>
+          <w:szCs w:val="24"/>
+        </w:rPr>
+        <w:t>“Study Notion” – a Full-Stack MERN application (MongoDB, Express.js, React.js, Node.js)</w:t>
+      </w:r>
+      <w:r>
+        <w:rPr>
+          <w:sz w:val="24"/>
+          <w:szCs w:val="24"/>
+        </w:rPr>
+        <w:t xml:space="preserve"> for </w:t>
+      </w:r>
+      <w:r>
+        <w:rPr>
+          <w:b/>
+          <w:bCs/>
+          <w:sz w:val="24"/>
+          <w:szCs w:val="24"/>
+        </w:rPr>
+        <w:t>students and educators</w:t>
+      </w:r>
+      <w:r>
+        <w:rPr>
+          <w:sz w:val="24"/>
+          <w:szCs w:val="24"/>
+        </w:rPr>
+        <w:t xml:space="preserve">, enabling </w:t>
+      </w:r>
+      <w:r>
+        <w:rPr>
+          <w:b/>
+          <w:bCs/>
+          <w:sz w:val="24"/>
+          <w:szCs w:val="24"/>
+        </w:rPr>
+        <w:t>course creation, management, and secure purchasing</w:t>
+      </w:r>
+      <w:r>
+        <w:rPr>
+          <w:sz w:val="24"/>
+          <w:szCs w:val="24"/>
+        </w:rPr>
+        <w:t xml:space="preserve"> with </w:t>
+      </w:r>
+      <w:r>
+        <w:rPr>
+          <w:b/>
+          <w:bCs/>
+          <w:sz w:val="24"/>
+          <w:szCs w:val="24"/>
+        </w:rPr>
+        <w:t>Razorpay integration and JWT-based authentication (cookies)</w:t>
+      </w:r>
+      <w:r>
+        <w:rPr>
+          <w:sz w:val="24"/>
+          <w:szCs w:val="24"/>
+        </w:rPr>
+        <w:t>.</w:t>
+      </w:r>
+    </w:p>
+    <w:p>
+      <w:pPr>
         <w:spacing w:after="120"/>
         <w:rPr>
           <w:sz w:val="24"/>
@@ -1358,35 +2585,78 @@
           <w:sz w:val="24"/>
           <w:szCs w:val="24"/>
         </w:rPr>
-        <w:t xml:space="preserve">Designed and launched a scalable full-stack web app supporting 500+ users, boosting </w:t>
-      </w:r>
-      <w:r>
-        <w:rPr>
-          <w:sz w:val="24"/>
-          <w:szCs w:val="24"/>
-        </w:rPr>
-        <w:t xml:space="preserve">engagement by 40%. Built a high </w:t>
-      </w:r>
-      <w:r>
-        <w:rPr>
-          <w:sz w:val="24"/>
-          <w:szCs w:val="24"/>
-        </w:rPr>
-        <w:t>performance UI with React/Tailwind, reducing load times by 35%. Integrated Razorp</w:t>
-      </w:r>
-      <w:r>
-        <w:rPr>
-          <w:sz w:val="24"/>
-          <w:szCs w:val="24"/>
-        </w:rPr>
-        <w:t xml:space="preserve">ay for secure payments (1,000+ </w:t>
-      </w:r>
-      <w:r>
-        <w:rPr>
-          <w:sz w:val="24"/>
-          <w:szCs w:val="24"/>
-        </w:rPr>
-        <w:t xml:space="preserve">transactions), and deployed on Vercel with 99.9% uptime. </w:t>
+        <w:t>2.</w:t>
+      </w:r>
+      <w:r>
+        <w:rPr>
+          <w:sz w:val="24"/>
+          <w:szCs w:val="24"/>
+        </w:rPr>
+        <w:t xml:space="preserve">  Performed thorough </w:t>
+      </w:r>
+      <w:r>
+        <w:rPr>
+          <w:b/>
+          <w:bCs/>
+          <w:sz w:val="24"/>
+          <w:szCs w:val="24"/>
+        </w:rPr>
+        <w:t>API testing using Postman</w:t>
+      </w:r>
+      <w:r>
+        <w:rPr>
+          <w:sz w:val="24"/>
+          <w:szCs w:val="24"/>
+        </w:rPr>
+        <w:t xml:space="preserve">, deployed the application on </w:t>
+      </w:r>
+      <w:r>
+        <w:rPr>
+          <w:b/>
+          <w:bCs/>
+          <w:sz w:val="24"/>
+          <w:szCs w:val="24"/>
+        </w:rPr>
+        <w:t>Vercel</w:t>
+      </w:r>
+      <w:r>
+        <w:rPr>
+          <w:sz w:val="24"/>
+          <w:szCs w:val="24"/>
+        </w:rPr>
+        <w:t xml:space="preserve">, and followed </w:t>
+      </w:r>
+      <w:r>
+        <w:rPr>
+          <w:b/>
+          <w:bCs/>
+          <w:sz w:val="24"/>
+          <w:szCs w:val="24"/>
+        </w:rPr>
+        <w:t>clean code principles, modular architecture, and best practices</w:t>
+      </w:r>
+      <w:r>
+        <w:rPr>
+          <w:sz w:val="24"/>
+          <w:szCs w:val="24"/>
+        </w:rPr>
+        <w:t xml:space="preserve"> to ensure </w:t>
+      </w:r>
+      <w:r>
+        <w:rPr>
+          <w:b/>
+          <w:bCs/>
+          <w:sz w:val="24"/>
+          <w:szCs w:val="24"/>
+        </w:rPr>
+        <w:t>scalability and maintainability</w:t>
+      </w:r>
+      <w:r>
+        <w:rPr>
+          <w:sz w:val="24"/>
+          <w:szCs w:val="24"/>
+        </w:rPr>
+        <w:t>.</w:t>
       </w:r>
     </w:p>
     <w:p>
@@ -1463,6 +2733,77 @@
     </w:p>
     <w:p>
       <w:pPr>
+        <w:spacing w:after="0"/>
+        <w:rPr>
+          <w:sz w:val="24"/>
+          <w:szCs w:val="24"/>
+        </w:rPr>
+      </w:pPr>
+      <w:r>
+        <w:rPr>
+          <w:sz w:val="24"/>
+          <w:szCs w:val="24"/>
+        </w:rPr>
+        <w:t>1.</w:t>
+      </w:r>
+      <w:r>
+        <w:rPr>
+          <w:sz w:val="24"/>
+          <w:szCs w:val="24"/>
+        </w:rPr>
+        <w:t xml:space="preserve"> Built an </w:t>
+      </w:r>
+      <w:r>
+        <w:rPr>
+          <w:b/>
+          <w:bCs/>
+          <w:sz w:val="24"/>
+          <w:szCs w:val="24"/>
+        </w:rPr>
+        <w:t>Online App Store – Full-Stack MERN application (MongoDB, Express.js, React.js, Node.js)</w:t>
+      </w:r>
+      <w:r>
+        <w:rPr>
+          <w:sz w:val="24"/>
+          <w:szCs w:val="24"/>
+        </w:rPr>
+        <w:t xml:space="preserve">, enabling </w:t>
+      </w:r>
+      <w:r>
+        <w:rPr>
+          <w:b/>
+          <w:bCs/>
+          <w:sz w:val="24"/>
+          <w:szCs w:val="24"/>
+        </w:rPr>
+        <w:t>app upload, management, and distribution</w:t>
+      </w:r>
+      <w:r>
+        <w:rPr>
+          <w:sz w:val="24"/>
+          <w:szCs w:val="24"/>
+        </w:rPr>
+        <w:t xml:space="preserve">, developed as a </w:t>
+      </w:r>
+      <w:r>
+        <w:rPr>
+          <w:b/>
+          <w:bCs/>
+          <w:sz w:val="24"/>
+          <w:szCs w:val="24"/>
+        </w:rPr>
+        <w:t>college project with advanced feature exploration</w:t>
+      </w:r>
+      <w:r>
+        <w:rPr>
+          <w:sz w:val="24"/>
+          <w:szCs w:val="24"/>
+        </w:rPr>
+        <w:t>.</w:t>
+      </w:r>
+    </w:p>
+    <w:p>
+      <w:pPr>
         <w:spacing w:after="120"/>
         <w:rPr>
           <w:sz w:val="24"/>
@@ -1474,35 +2815,62 @@
           <w:sz w:val="24"/>
           <w:szCs w:val="24"/>
         </w:rPr>
-        <w:t>Built a highly responsive user interface in React.js with 98% cross-device compatibility. Imple</w:t>
-      </w:r>
-      <w:r>
-        <w:rPr>
-          <w:sz w:val="24"/>
-          <w:szCs w:val="24"/>
-        </w:rPr>
-        <w:t xml:space="preserve">mented Redux for optimal state </w:t>
-      </w:r>
-      <w:r>
-        <w:rPr>
-          <w:sz w:val="24"/>
-          <w:szCs w:val="24"/>
-        </w:rPr>
-        <w:t xml:space="preserve">management, reducing prop drilling by 80% and boosting development speed by 40%. </w:t>
-      </w:r>
-      <w:r>
-        <w:rPr>
-          <w:sz w:val="24"/>
-          <w:szCs w:val="24"/>
-        </w:rPr>
-        <w:t xml:space="preserve">Integrated a robust commenting </w:t>
-      </w:r>
-      <w:r>
-        <w:rPr>
-          <w:sz w:val="24"/>
-          <w:szCs w:val="24"/>
-        </w:rPr>
-        <w:t xml:space="preserve">system supporting 5,000+ user interactions seamlessly. </w:t>
+        <w:t>2.</w:t>
+      </w:r>
+      <w:r>
+        <w:rPr>
+          <w:sz w:val="24"/>
+          <w:szCs w:val="24"/>
+        </w:rPr>
+        <w:t xml:space="preserve">  Implemented </w:t>
+      </w:r>
+      <w:r>
+        <w:rPr>
+          <w:b/>
+          <w:bCs/>
+          <w:sz w:val="24"/>
+          <w:szCs w:val="24"/>
+        </w:rPr>
+        <w:t>file storage using Google Drive APIs</w:t>
+      </w:r>
+      <w:r>
+        <w:rPr>
+          <w:sz w:val="24"/>
+          <w:szCs w:val="24"/>
+        </w:rPr>
+        <w:t xml:space="preserve">, managed </w:t>
+      </w:r>
+      <w:r>
+        <w:rPr>
+          <w:b/>
+          <w:bCs/>
+          <w:sz w:val="24"/>
+          <w:szCs w:val="24"/>
+        </w:rPr>
+        <w:t>media uploads via Cloudinary</w:t>
+      </w:r>
+      <w:r>
+        <w:rPr>
+          <w:sz w:val="24"/>
+          <w:szCs w:val="24"/>
+        </w:rPr>
+        <w:t xml:space="preserve">, and integrated </w:t>
+      </w:r>
+      <w:r>
+        <w:rPr>
+          <w:b/>
+          <w:bCs/>
+          <w:sz w:val="24"/>
+          <w:szCs w:val="24"/>
+        </w:rPr>
+        <w:t>secure authentication using JWT with cookies</w:t>
+      </w:r>
+      <w:r>
+        <w:rPr>
+          <w:sz w:val="24"/>
+          <w:szCs w:val="24"/>
+        </w:rPr>
+        <w:t>, while exploring new technologies and real-world integrations.</w:t>
       </w:r>
     </w:p>
     <w:p>
@@ -1579,46 +2947,158 @@
     </w:p>
     <w:p>
       <w:pPr>
-        <w:spacing w:after="240"/>
-        <w:rPr>
-          <w:sz w:val="24"/>
-          <w:szCs w:val="24"/>
-        </w:rPr>
-      </w:pPr>
-      <w:r>
-        <w:rPr>
-          <w:sz w:val="24"/>
-          <w:szCs w:val="24"/>
-        </w:rPr>
-        <w:t>Designed and deployed a secure, real-time chat application using React.js, Node.js, Ex</w:t>
-      </w:r>
-      <w:r>
-        <w:rPr>
-          <w:sz w:val="24"/>
-          <w:szCs w:val="24"/>
-        </w:rPr>
-        <w:t xml:space="preserve">press, MongoDB, and Socket.IO. </w:t>
-      </w:r>
-      <w:r>
-        <w:rPr>
-          <w:sz w:val="24"/>
-          <w:szCs w:val="24"/>
-        </w:rPr>
-        <w:t>Supported 1,000+ users with instant messaging, group chats, and file sharing. Achieved 9</w:t>
-      </w:r>
-      <w:r>
-        <w:rPr>
-          <w:sz w:val="24"/>
-          <w:szCs w:val="24"/>
-        </w:rPr>
-        <w:t xml:space="preserve">9.9% uptime, processed 10,000+ </w:t>
-      </w:r>
-      <w:r>
-        <w:rPr>
-          <w:sz w:val="24"/>
-          <w:szCs w:val="24"/>
-        </w:rPr>
-        <w:t>messages securely with JWT authentication and fast, responsive UI.</w:t>
+        <w:spacing w:after="0"/>
+        <w:rPr>
+          <w:sz w:val="24"/>
+          <w:szCs w:val="24"/>
+        </w:rPr>
+      </w:pPr>
+      <w:r>
+        <w:rPr>
+          <w:sz w:val="24"/>
+          <w:szCs w:val="24"/>
+        </w:rPr>
+        <w:t>1.</w:t>
+      </w:r>
+      <w:r>
+        <w:rPr>
+          <w:sz w:val="24"/>
+          <w:szCs w:val="24"/>
+        </w:rPr>
+        <w:t xml:space="preserve">  </w:t>
+      </w:r>
+      <w:r>
+        <w:rPr>
+          <w:sz w:val="24"/>
+          <w:szCs w:val="24"/>
+        </w:rPr>
+        <w:t>B</w:t>
+      </w:r>
+      <w:r>
+        <w:rPr>
+          <w:sz w:val="24"/>
+          <w:szCs w:val="24"/>
+        </w:rPr>
+        <w:t xml:space="preserve">uilt a </w:t>
+      </w:r>
+      <w:r>
+        <w:rPr>
+          <w:b/>
+          <w:bCs/>
+          <w:sz w:val="24"/>
+          <w:szCs w:val="24"/>
+        </w:rPr>
+        <w:t>Real-Time Chat Application using MERN Stack (MongoDB, Express.js, React.js, Node.js)</w:t>
+      </w:r>
+      <w:r>
+        <w:rPr>
+          <w:sz w:val="24"/>
+          <w:szCs w:val="24"/>
+        </w:rPr>
+        <w:t xml:space="preserve">, enabling </w:t>
+      </w:r>
+      <w:r>
+        <w:rPr>
+          <w:b/>
+          <w:bCs/>
+          <w:sz w:val="24"/>
+          <w:szCs w:val="24"/>
+        </w:rPr>
+        <w:t>messaging, voice calls, and video calls</w:t>
+      </w:r>
+      <w:r>
+        <w:rPr>
+          <w:sz w:val="24"/>
+          <w:szCs w:val="24"/>
+        </w:rPr>
+        <w:t xml:space="preserve"> with integration of </w:t>
+      </w:r>
+      <w:r>
+        <w:rPr>
+          <w:b/>
+          <w:bCs/>
+          <w:sz w:val="24"/>
+          <w:szCs w:val="24"/>
+        </w:rPr>
+        <w:t>Stream (Streamify) APIs</w:t>
+      </w:r>
+      <w:r>
+        <w:rPr>
+          <w:sz w:val="24"/>
+          <w:szCs w:val="24"/>
+        </w:rPr>
+        <w:t xml:space="preserve"> for enhanced communication features.</w:t>
+      </w:r>
+    </w:p>
+    <w:p>
+      <w:pPr>
+        <w:spacing w:after="120"/>
+        <w:rPr>
+          <w:sz w:val="24"/>
+          <w:szCs w:val="24"/>
+        </w:rPr>
+      </w:pPr>
+      <w:r>
+        <w:rPr>
+          <w:sz w:val="24"/>
+          <w:szCs w:val="24"/>
+        </w:rPr>
+        <w:t>2.</w:t>
+      </w:r>
+      <w:r>
+        <w:rPr>
+          <w:sz w:val="24"/>
+          <w:szCs w:val="24"/>
+        </w:rPr>
+        <w:t xml:space="preserve">  Implemented advanced </w:t>
+      </w:r>
+      <w:r>
+        <w:rPr>
+          <w:b/>
+          <w:bCs/>
+          <w:sz w:val="24"/>
+          <w:szCs w:val="24"/>
+        </w:rPr>
+        <w:t>authentication using JWT (Access &amp; Refresh Tokens)</w:t>
+      </w:r>
+      <w:r>
+        <w:rPr>
+          <w:sz w:val="24"/>
+          <w:szCs w:val="24"/>
+        </w:rPr>
+        <w:t xml:space="preserve"> and managed application state with </w:t>
+      </w:r>
+      <w:r>
+        <w:rPr>
+          <w:b/>
+          <w:bCs/>
+          <w:sz w:val="24"/>
+          <w:szCs w:val="24"/>
+        </w:rPr>
+        <w:t>Redux</w:t>
+      </w:r>
+      <w:r>
+        <w:rPr>
+          <w:sz w:val="24"/>
+          <w:szCs w:val="24"/>
+        </w:rPr>
+        <w:t xml:space="preserve">, ensuring </w:t>
+      </w:r>
+      <w:r>
+        <w:rPr>
+          <w:b/>
+          <w:bCs/>
+          <w:sz w:val="24"/>
+          <w:szCs w:val="24"/>
+        </w:rPr>
+        <w:t>secure, scalable, and real-time user experience</w:t>
+      </w:r>
+      <w:r>
+        <w:rPr>
+          <w:sz w:val="24"/>
+          <w:szCs w:val="24"/>
+        </w:rPr>
+        <w:t>.</w:t>
       </w:r>
     </w:p>
     <w:p>

</xml_diff>